<commit_message>
Exercicios | Exercicios de aula
</commit_message>
<xml_diff>
--- a/Segundo_Semestre/Material de Aula/2 semestre/LISTA OPERADORES ARITMÉDICOS, RELACIONAIS E LOGICOS.docx
+++ b/Segundo_Semestre/Material de Aula/2 semestre/LISTA OPERADORES ARITMÉDICOS, RELACIONAIS E LOGICOS.docx
@@ -1,6 +1,6 @@
 
 <file path=word/document.xml><?xml version="1.0" encoding="utf-8"?>
-<w:document xmlns:wpc="http://schemas.microsoft.com/office/word/2010/wordprocessingCanvas" xmlns:cx="http://schemas.microsoft.com/office/drawing/2014/chartex" xmlns:cx1="http://schemas.microsoft.com/office/drawing/2015/9/8/chartex" xmlns:cx2="http://schemas.microsoft.com/office/drawing/2015/10/21/chartex" xmlns:cx3="http://schemas.microsoft.com/office/drawing/2016/5/9/chartex" xmlns:cx4="http://schemas.microsoft.com/office/drawing/2016/5/10/chartex" xmlns:cx5="http://schemas.microsoft.com/office/drawing/2016/5/11/chartex" xmlns:cx6="http://schemas.microsoft.com/office/drawing/2016/5/12/chartex" xmlns:cx7="http://schemas.microsoft.com/office/drawing/2016/5/13/chartex" xmlns:cx8="http://schemas.microsoft.com/office/drawing/2016/5/14/chartex" xmlns:mc="http://schemas.openxmlformats.org/markup-compatibility/2006" xmlns:aink="http://schemas.microsoft.com/office/drawing/2016/ink" xmlns:am3d="http://schemas.microsoft.com/office/drawing/2017/model3d" xmlns:o="urn:schemas-microsoft-com:office:office" xmlns:oel="http://schemas.microsoft.com/office/2019/extlst" xmlns:r="http://schemas.openxmlformats.org/officeDocument/2006/relationships" xmlns:m="http://schemas.openxmlformats.org/officeDocument/2006/math" xmlns:v="urn:schemas-microsoft-com:vml" xmlns:wp14="http://schemas.microsoft.com/office/word/2010/wordprocessingDrawing" xmlns:wp="http://schemas.openxmlformats.org/drawingml/2006/wordprocessingDrawing" xmlns:w10="urn:schemas-microsoft-com:office:word" xmlns:w="http://schemas.openxmlformats.org/wordprocessingml/2006/main" xmlns:w14="http://schemas.microsoft.com/office/word/2010/wordml" xmlns:w15="http://schemas.microsoft.com/office/word/2012/wordml" xmlns:w16cex="http://schemas.microsoft.com/office/word/2018/wordml/cex" xmlns:w16cid="http://schemas.microsoft.com/office/word/2016/wordml/cid" xmlns:w16="http://schemas.microsoft.com/office/word/2018/wordml" xmlns:w16sdtdh="http://schemas.microsoft.com/office/word/2020/wordml/sdtdatahash" xmlns:w16se="http://schemas.microsoft.com/office/word/2015/wordml/symex" xmlns:wpg="http://schemas.microsoft.com/office/word/2010/wordprocessingGroup" xmlns:wpi="http://schemas.microsoft.com/office/word/2010/wordprocessingInk" xmlns:wne="http://schemas.microsoft.com/office/word/2006/wordml" xmlns:wps="http://schemas.microsoft.com/office/word/2010/wordprocessingShape" mc:Ignorable="w14 w15 w16se w16cid w16 w16cex w16sdtdh wp14">
+<w:document xmlns:wpc="http://schemas.microsoft.com/office/word/2010/wordprocessingCanvas" xmlns:cx="http://schemas.microsoft.com/office/drawing/2014/chartex" xmlns:cx1="http://schemas.microsoft.com/office/drawing/2015/9/8/chartex" xmlns:cx2="http://schemas.microsoft.com/office/drawing/2015/10/21/chartex" xmlns:cx3="http://schemas.microsoft.com/office/drawing/2016/5/9/chartex" xmlns:cx4="http://schemas.microsoft.com/office/drawing/2016/5/10/chartex" xmlns:cx5="http://schemas.microsoft.com/office/drawing/2016/5/11/chartex" xmlns:cx6="http://schemas.microsoft.com/office/drawing/2016/5/12/chartex" xmlns:cx7="http://schemas.microsoft.com/office/drawing/2016/5/13/chartex" xmlns:cx8="http://schemas.microsoft.com/office/drawing/2016/5/14/chartex" xmlns:mc="http://schemas.openxmlformats.org/markup-compatibility/2006" xmlns:aink="http://schemas.microsoft.com/office/drawing/2016/ink" xmlns:am3d="http://schemas.microsoft.com/office/drawing/2017/model3d" xmlns:o="urn:schemas-microsoft-com:office:office" xmlns:r="http://schemas.openxmlformats.org/officeDocument/2006/relationships" xmlns:m="http://schemas.openxmlformats.org/officeDocument/2006/math" xmlns:v="urn:schemas-microsoft-com:vml" xmlns:wp14="http://schemas.microsoft.com/office/word/2010/wordprocessingDrawing" xmlns:wp="http://schemas.openxmlformats.org/drawingml/2006/wordprocessingDrawing" xmlns:w10="urn:schemas-microsoft-com:office:word" xmlns:w="http://schemas.openxmlformats.org/wordprocessingml/2006/main" xmlns:w14="http://schemas.microsoft.com/office/word/2010/wordml" xmlns:w15="http://schemas.microsoft.com/office/word/2012/wordml" xmlns:w16cex="http://schemas.microsoft.com/office/word/2018/wordml/cex" xmlns:w16cid="http://schemas.microsoft.com/office/word/2016/wordml/cid" xmlns:w16="http://schemas.microsoft.com/office/word/2018/wordml" xmlns:w16sdtdh="http://schemas.microsoft.com/office/word/2020/wordml/sdtdatahash" xmlns:w16se="http://schemas.microsoft.com/office/word/2015/wordml/symex" xmlns:wpg="http://schemas.microsoft.com/office/word/2010/wordprocessingGroup" xmlns:wpi="http://schemas.microsoft.com/office/word/2010/wordprocessingInk" xmlns:wne="http://schemas.microsoft.com/office/word/2006/wordml" xmlns:wps="http://schemas.microsoft.com/office/word/2010/wordprocessingShape" mc:Ignorable="w14 w15 w16se w16cid w16 w16cex w16sdtdh wp14">
   <w:body>
     <w:p>
       <w:pPr>
@@ -70,18 +70,12 @@
     </w:p>
     <w:p>
       <w:pPr>
+        <w:pStyle w:val="PargrafodaLista"/>
+        <w:numPr>
+          <w:ilvl w:val="0"/>
+          <w:numId w:val="3"/>
+        </w:numPr>
         <w:spacing w:after="0" w:line="420" w:lineRule="atLeast"/>
-        <w:rPr>
-          <w:rFonts w:ascii="Arial" w:eastAsia="Times New Roman" w:hAnsi="Arial" w:cs="Arial"/>
-          <w:color w:val="1F1F1F"/>
-          <w:kern w:val="0"/>
-          <w:sz w:val="24"/>
-          <w:szCs w:val="24"/>
-          <w:lang w:eastAsia="pt-BR"/>
-          <w14:ligatures w14:val="none"/>
-        </w:rPr>
-      </w:pPr>
-      <w:r>
         <w:rPr>
           <w:rFonts w:ascii="Arial" w:eastAsia="Times New Roman" w:hAnsi="Arial" w:cs="Arial"/>
           <w:b/>
@@ -93,23 +87,12 @@
           <w:lang w:eastAsia="pt-BR"/>
           <w14:ligatures w14:val="none"/>
         </w:rPr>
-        <w:t>1.</w:t>
-      </w:r>
-      <w:r>
-        <w:rPr>
-          <w:rFonts w:ascii="Arial" w:eastAsia="Times New Roman" w:hAnsi="Arial" w:cs="Arial"/>
-          <w:color w:val="1F1F1F"/>
-          <w:kern w:val="0"/>
-          <w:sz w:val="24"/>
-          <w:szCs w:val="24"/>
-          <w:lang w:eastAsia="pt-BR"/>
-          <w14:ligatures w14:val="none"/>
-        </w:rPr>
-        <w:t xml:space="preserve"> </w:t>
-      </w:r>
-      <w:r>
-        <w:rPr>
-          <w:rFonts w:ascii="Arial" w:eastAsia="Times New Roman" w:hAnsi="Arial" w:cs="Arial"/>
+      </w:pPr>
+      <w:r>
+        <w:rPr>
+          <w:rFonts w:ascii="Arial" w:eastAsia="Times New Roman" w:hAnsi="Arial" w:cs="Arial"/>
+          <w:b/>
+          <w:bCs/>
           <w:color w:val="1F1F1F"/>
           <w:kern w:val="0"/>
           <w:sz w:val="24"/>
@@ -122,6 +105,7 @@
     </w:p>
     <w:p>
       <w:pPr>
+        <w:pStyle w:val="PargrafodaLista"/>
         <w:spacing w:after="0" w:line="420" w:lineRule="atLeast"/>
         <w:rPr>
           <w:rFonts w:ascii="Arial" w:eastAsia="Times New Roman" w:hAnsi="Arial" w:cs="Arial"/>
@@ -134,6 +118,166 @@
         </w:rPr>
       </w:pPr>
       <w:r>
+        <w:rPr>
+          <w:rFonts w:ascii="Arial" w:eastAsia="Times New Roman" w:hAnsi="Arial" w:cs="Arial"/>
+          <w:color w:val="1F1F1F"/>
+          <w:kern w:val="0"/>
+          <w:sz w:val="24"/>
+          <w:szCs w:val="24"/>
+          <w:lang w:eastAsia="pt-BR"/>
+          <w14:ligatures w14:val="none"/>
+        </w:rPr>
+        <w:t xml:space="preserve">SELECT </w:t>
+      </w:r>
+      <w:proofErr w:type="gramStart"/>
+      <w:r>
+        <w:rPr>
+          <w:rFonts w:ascii="Arial" w:eastAsia="Times New Roman" w:hAnsi="Arial" w:cs="Arial"/>
+          <w:color w:val="1F1F1F"/>
+          <w:kern w:val="0"/>
+          <w:sz w:val="24"/>
+          <w:szCs w:val="24"/>
+          <w:lang w:eastAsia="pt-BR"/>
+          <w14:ligatures w14:val="none"/>
+        </w:rPr>
+        <w:t>AVG(</w:t>
+      </w:r>
+      <w:proofErr w:type="gramEnd"/>
+      <w:r>
+        <w:rPr>
+          <w:rFonts w:ascii="Arial" w:eastAsia="Times New Roman" w:hAnsi="Arial" w:cs="Arial"/>
+          <w:color w:val="1F1F1F"/>
+          <w:kern w:val="0"/>
+          <w:sz w:val="24"/>
+          <w:szCs w:val="24"/>
+          <w:lang w:eastAsia="pt-BR"/>
+          <w14:ligatures w14:val="none"/>
+        </w:rPr>
+        <w:t>salario) FROM funcionário WHERE departamento = ‘Sales’ AND experiencia &gt; 5;</w:t>
+      </w:r>
+    </w:p>
+    <w:p>
+      <w:pPr>
+        <w:pStyle w:val="PargrafodaLista"/>
+        <w:spacing w:after="0" w:line="420" w:lineRule="atLeast"/>
+        <w:rPr>
+          <w:rFonts w:ascii="Arial" w:eastAsia="Times New Roman" w:hAnsi="Arial" w:cs="Arial"/>
+          <w:color w:val="1F1F1F"/>
+          <w:kern w:val="0"/>
+          <w:sz w:val="24"/>
+          <w:szCs w:val="24"/>
+          <w:lang w:eastAsia="pt-BR"/>
+          <w14:ligatures w14:val="none"/>
+        </w:rPr>
+      </w:pPr>
+    </w:p>
+    <w:p>
+      <w:pPr>
+        <w:pStyle w:val="PargrafodaLista"/>
+        <w:numPr>
+          <w:ilvl w:val="0"/>
+          <w:numId w:val="3"/>
+        </w:numPr>
+        <w:spacing w:after="0" w:line="420" w:lineRule="atLeast"/>
+        <w:rPr>
+          <w:rFonts w:ascii="Arial" w:eastAsia="Times New Roman" w:hAnsi="Arial" w:cs="Arial"/>
+          <w:color w:val="1F1F1F"/>
+          <w:kern w:val="0"/>
+          <w:sz w:val="24"/>
+          <w:szCs w:val="24"/>
+          <w:lang w:eastAsia="pt-BR"/>
+          <w14:ligatures w14:val="none"/>
+        </w:rPr>
+      </w:pPr>
+      <w:r>
+        <w:rPr>
+          <w:rFonts w:ascii="Arial" w:eastAsia="Times New Roman" w:hAnsi="Arial" w:cs="Arial"/>
+          <w:color w:val="1F1F1F"/>
+          <w:kern w:val="0"/>
+          <w:sz w:val="24"/>
+          <w:szCs w:val="24"/>
+          <w:lang w:eastAsia="pt-BR"/>
+          <w14:ligatures w14:val="none"/>
+        </w:rPr>
+        <w:t>Liste os nomes dos funcionários que ganham mais que a média salarial do departamento em que trabalham.</w:t>
+      </w:r>
+    </w:p>
+    <w:p>
+      <w:pPr>
+        <w:pStyle w:val="PargrafodaLista"/>
+        <w:spacing w:after="0" w:line="420" w:lineRule="atLeast"/>
+        <w:rPr>
+          <w:rFonts w:ascii="Arial" w:eastAsia="Times New Roman" w:hAnsi="Arial" w:cs="Arial"/>
+          <w:color w:val="1F1F1F"/>
+          <w:kern w:val="0"/>
+          <w:sz w:val="24"/>
+          <w:szCs w:val="24"/>
+          <w:lang w:eastAsia="pt-BR"/>
+          <w14:ligatures w14:val="none"/>
+        </w:rPr>
+      </w:pPr>
+      <w:r>
+        <w:rPr>
+          <w:rFonts w:ascii="Arial" w:eastAsia="Times New Roman" w:hAnsi="Arial" w:cs="Arial"/>
+          <w:color w:val="1F1F1F"/>
+          <w:kern w:val="0"/>
+          <w:sz w:val="24"/>
+          <w:szCs w:val="24"/>
+          <w:lang w:eastAsia="pt-BR"/>
+          <w14:ligatures w14:val="none"/>
+        </w:rPr>
+        <w:t xml:space="preserve">SELECT nome FROM funcionários WHERE </w:t>
+      </w:r>
+      <w:proofErr w:type="gramStart"/>
+      <w:r>
+        <w:rPr>
+          <w:rFonts w:ascii="Arial" w:eastAsia="Times New Roman" w:hAnsi="Arial" w:cs="Arial"/>
+          <w:color w:val="1F1F1F"/>
+          <w:kern w:val="0"/>
+          <w:sz w:val="24"/>
+          <w:szCs w:val="24"/>
+          <w:lang w:eastAsia="pt-BR"/>
+          <w14:ligatures w14:val="none"/>
+        </w:rPr>
+        <w:t>AVG(</w:t>
+      </w:r>
+      <w:proofErr w:type="gramEnd"/>
+      <w:r>
+        <w:rPr>
+          <w:rFonts w:ascii="Arial" w:eastAsia="Times New Roman" w:hAnsi="Arial" w:cs="Arial"/>
+          <w:color w:val="1F1F1F"/>
+          <w:kern w:val="0"/>
+          <w:sz w:val="24"/>
+          <w:szCs w:val="24"/>
+          <w:lang w:eastAsia="pt-BR"/>
+          <w14:ligatures w14:val="none"/>
+        </w:rPr>
+        <w:t xml:space="preserve">salario) &gt; </w:t>
+      </w:r>
+    </w:p>
+    <w:p>
+      <w:pPr>
+        <w:pStyle w:val="PargrafodaLista"/>
+        <w:spacing w:after="0" w:line="420" w:lineRule="atLeast"/>
+        <w:rPr>
+          <w:rFonts w:ascii="Arial" w:eastAsia="Times New Roman" w:hAnsi="Arial" w:cs="Arial"/>
+          <w:color w:val="1F1F1F"/>
+          <w:kern w:val="0"/>
+          <w:sz w:val="24"/>
+          <w:szCs w:val="24"/>
+          <w:lang w:eastAsia="pt-BR"/>
+          <w14:ligatures w14:val="none"/>
+        </w:rPr>
+      </w:pPr>
+    </w:p>
+    <w:p>
+      <w:pPr>
+        <w:pStyle w:val="PargrafodaLista"/>
+        <w:numPr>
+          <w:ilvl w:val="0"/>
+          <w:numId w:val="3"/>
+        </w:numPr>
+        <w:spacing w:after="0" w:line="420" w:lineRule="atLeast"/>
         <w:rPr>
           <w:rFonts w:ascii="Arial" w:eastAsia="Times New Roman" w:hAnsi="Arial" w:cs="Arial"/>
           <w:b/>
@@ -142,27 +286,28 @@
           <w:kern w:val="0"/>
           <w:sz w:val="24"/>
           <w:szCs w:val="24"/>
-          <w:bdr w:val="none" w:sz="0" w:space="0" w:color="auto" w:frame="1"/>
-          <w:lang w:eastAsia="pt-BR"/>
-          <w14:ligatures w14:val="none"/>
-        </w:rPr>
-        <w:t>2.</w:t>
-      </w:r>
-      <w:r>
-        <w:rPr>
-          <w:rFonts w:ascii="Arial" w:eastAsia="Times New Roman" w:hAnsi="Arial" w:cs="Arial"/>
-          <w:color w:val="1F1F1F"/>
-          <w:kern w:val="0"/>
-          <w:sz w:val="24"/>
-          <w:szCs w:val="24"/>
-          <w:lang w:eastAsia="pt-BR"/>
-          <w14:ligatures w14:val="none"/>
-        </w:rPr>
-        <w:t xml:space="preserve"> Liste os nomes dos funcionários que ganham mais que a média salarial do departamento em que trabalham.</w:t>
+          <w:lang w:eastAsia="pt-BR"/>
+          <w14:ligatures w14:val="none"/>
+        </w:rPr>
+      </w:pPr>
+      <w:r>
+        <w:rPr>
+          <w:rFonts w:ascii="Arial" w:eastAsia="Times New Roman" w:hAnsi="Arial" w:cs="Arial"/>
+          <w:b/>
+          <w:bCs/>
+          <w:color w:val="1F1F1F"/>
+          <w:kern w:val="0"/>
+          <w:sz w:val="24"/>
+          <w:szCs w:val="24"/>
+          <w:lang w:eastAsia="pt-BR"/>
+          <w14:ligatures w14:val="none"/>
+        </w:rPr>
+        <w:t>Calcule o total de vendas por país e ordene os resultados do maior para o menor.</w:t>
       </w:r>
     </w:p>
     <w:p>
       <w:pPr>
+        <w:pStyle w:val="PargrafodaLista"/>
         <w:spacing w:after="0" w:line="420" w:lineRule="atLeast"/>
         <w:rPr>
           <w:rFonts w:ascii="Arial" w:eastAsia="Times New Roman" w:hAnsi="Arial" w:cs="Arial"/>
@@ -175,6 +320,225 @@
         </w:rPr>
       </w:pPr>
       <w:r>
+        <w:rPr>
+          <w:rFonts w:ascii="Arial" w:eastAsia="Times New Roman" w:hAnsi="Arial" w:cs="Arial"/>
+          <w:color w:val="1F1F1F"/>
+          <w:kern w:val="0"/>
+          <w:sz w:val="24"/>
+          <w:szCs w:val="24"/>
+          <w:lang w:eastAsia="pt-BR"/>
+          <w14:ligatures w14:val="none"/>
+        </w:rPr>
+        <w:t xml:space="preserve">SELECT </w:t>
+      </w:r>
+      <w:proofErr w:type="spellStart"/>
+      <w:proofErr w:type="gramStart"/>
+      <w:r>
+        <w:rPr>
+          <w:rFonts w:ascii="Arial" w:eastAsia="Times New Roman" w:hAnsi="Arial" w:cs="Arial"/>
+          <w:color w:val="1F1F1F"/>
+          <w:kern w:val="0"/>
+          <w:sz w:val="24"/>
+          <w:szCs w:val="24"/>
+          <w:lang w:eastAsia="pt-BR"/>
+          <w14:ligatures w14:val="none"/>
+        </w:rPr>
+        <w:t>v.pais</w:t>
+      </w:r>
+      <w:proofErr w:type="spellEnd"/>
+      <w:proofErr w:type="gramEnd"/>
+      <w:r>
+        <w:rPr>
+          <w:rFonts w:ascii="Arial" w:eastAsia="Times New Roman" w:hAnsi="Arial" w:cs="Arial"/>
+          <w:color w:val="1F1F1F"/>
+          <w:kern w:val="0"/>
+          <w:sz w:val="24"/>
+          <w:szCs w:val="24"/>
+          <w:lang w:eastAsia="pt-BR"/>
+          <w14:ligatures w14:val="none"/>
+        </w:rPr>
+        <w:t>, SUM(</w:t>
+      </w:r>
+      <w:proofErr w:type="spellStart"/>
+      <w:r>
+        <w:rPr>
+          <w:rFonts w:ascii="Arial" w:eastAsia="Times New Roman" w:hAnsi="Arial" w:cs="Arial"/>
+          <w:color w:val="1F1F1F"/>
+          <w:kern w:val="0"/>
+          <w:sz w:val="24"/>
+          <w:szCs w:val="24"/>
+          <w:lang w:eastAsia="pt-BR"/>
+          <w14:ligatures w14:val="none"/>
+        </w:rPr>
+        <w:t>v.valor_venda</w:t>
+      </w:r>
+      <w:proofErr w:type="spellEnd"/>
+      <w:r>
+        <w:rPr>
+          <w:rFonts w:ascii="Arial" w:eastAsia="Times New Roman" w:hAnsi="Arial" w:cs="Arial"/>
+          <w:color w:val="1F1F1F"/>
+          <w:kern w:val="0"/>
+          <w:sz w:val="24"/>
+          <w:szCs w:val="24"/>
+          <w:lang w:eastAsia="pt-BR"/>
+          <w14:ligatures w14:val="none"/>
+        </w:rPr>
+        <w:t xml:space="preserve">) AS </w:t>
+      </w:r>
+      <w:proofErr w:type="spellStart"/>
+      <w:r>
+        <w:rPr>
+          <w:rFonts w:ascii="Arial" w:eastAsia="Times New Roman" w:hAnsi="Arial" w:cs="Arial"/>
+          <w:color w:val="1F1F1F"/>
+          <w:kern w:val="0"/>
+          <w:sz w:val="24"/>
+          <w:szCs w:val="24"/>
+          <w:lang w:eastAsia="pt-BR"/>
+          <w14:ligatures w14:val="none"/>
+        </w:rPr>
+        <w:t>total_vendas</w:t>
+      </w:r>
+      <w:proofErr w:type="spellEnd"/>
+      <w:r>
+        <w:rPr>
+          <w:rFonts w:ascii="Arial" w:eastAsia="Times New Roman" w:hAnsi="Arial" w:cs="Arial"/>
+          <w:color w:val="1F1F1F"/>
+          <w:kern w:val="0"/>
+          <w:sz w:val="24"/>
+          <w:szCs w:val="24"/>
+          <w:lang w:eastAsia="pt-BR"/>
+          <w14:ligatures w14:val="none"/>
+        </w:rPr>
+        <w:t xml:space="preserve"> FROM vendas v INNER JOIN </w:t>
+      </w:r>
+      <w:proofErr w:type="spellStart"/>
+      <w:r>
+        <w:rPr>
+          <w:rFonts w:ascii="Arial" w:eastAsia="Times New Roman" w:hAnsi="Arial" w:cs="Arial"/>
+          <w:color w:val="1F1F1F"/>
+          <w:kern w:val="0"/>
+          <w:sz w:val="24"/>
+          <w:szCs w:val="24"/>
+          <w:lang w:eastAsia="pt-BR"/>
+          <w14:ligatures w14:val="none"/>
+        </w:rPr>
+        <w:t>paises</w:t>
+      </w:r>
+      <w:proofErr w:type="spellEnd"/>
+      <w:r>
+        <w:rPr>
+          <w:rFonts w:ascii="Arial" w:eastAsia="Times New Roman" w:hAnsi="Arial" w:cs="Arial"/>
+          <w:color w:val="1F1F1F"/>
+          <w:kern w:val="0"/>
+          <w:sz w:val="24"/>
+          <w:szCs w:val="24"/>
+          <w:lang w:eastAsia="pt-BR"/>
+          <w14:ligatures w14:val="none"/>
+        </w:rPr>
+        <w:t xml:space="preserve"> p ON </w:t>
+      </w:r>
+      <w:proofErr w:type="spellStart"/>
+      <w:r>
+        <w:rPr>
+          <w:rFonts w:ascii="Arial" w:eastAsia="Times New Roman" w:hAnsi="Arial" w:cs="Arial"/>
+          <w:color w:val="1F1F1F"/>
+          <w:kern w:val="0"/>
+          <w:sz w:val="24"/>
+          <w:szCs w:val="24"/>
+          <w:lang w:eastAsia="pt-BR"/>
+          <w14:ligatures w14:val="none"/>
+        </w:rPr>
+        <w:t>v.pais_id</w:t>
+      </w:r>
+      <w:proofErr w:type="spellEnd"/>
+      <w:r>
+        <w:rPr>
+          <w:rFonts w:ascii="Arial" w:eastAsia="Times New Roman" w:hAnsi="Arial" w:cs="Arial"/>
+          <w:color w:val="1F1F1F"/>
+          <w:kern w:val="0"/>
+          <w:sz w:val="24"/>
+          <w:szCs w:val="24"/>
+          <w:lang w:eastAsia="pt-BR"/>
+          <w14:ligatures w14:val="none"/>
+        </w:rPr>
+        <w:t xml:space="preserve"> = p.id GROUP BY </w:t>
+      </w:r>
+      <w:proofErr w:type="spellStart"/>
+      <w:r>
+        <w:rPr>
+          <w:rFonts w:ascii="Arial" w:eastAsia="Times New Roman" w:hAnsi="Arial" w:cs="Arial"/>
+          <w:color w:val="1F1F1F"/>
+          <w:kern w:val="0"/>
+          <w:sz w:val="24"/>
+          <w:szCs w:val="24"/>
+          <w:lang w:eastAsia="pt-BR"/>
+          <w14:ligatures w14:val="none"/>
+        </w:rPr>
+        <w:t>v.pais</w:t>
+      </w:r>
+      <w:proofErr w:type="spellEnd"/>
+      <w:r>
+        <w:rPr>
+          <w:rFonts w:ascii="Arial" w:eastAsia="Times New Roman" w:hAnsi="Arial" w:cs="Arial"/>
+          <w:color w:val="1F1F1F"/>
+          <w:kern w:val="0"/>
+          <w:sz w:val="24"/>
+          <w:szCs w:val="24"/>
+          <w:lang w:eastAsia="pt-BR"/>
+          <w14:ligatures w14:val="none"/>
+        </w:rPr>
+        <w:t xml:space="preserve"> ORDER BY </w:t>
+      </w:r>
+      <w:proofErr w:type="spellStart"/>
+      <w:r>
+        <w:rPr>
+          <w:rFonts w:ascii="Arial" w:eastAsia="Times New Roman" w:hAnsi="Arial" w:cs="Arial"/>
+          <w:color w:val="1F1F1F"/>
+          <w:kern w:val="0"/>
+          <w:sz w:val="24"/>
+          <w:szCs w:val="24"/>
+          <w:lang w:eastAsia="pt-BR"/>
+          <w14:ligatures w14:val="none"/>
+        </w:rPr>
+        <w:t>total_vendas</w:t>
+      </w:r>
+      <w:proofErr w:type="spellEnd"/>
+      <w:r>
+        <w:rPr>
+          <w:rFonts w:ascii="Arial" w:eastAsia="Times New Roman" w:hAnsi="Arial" w:cs="Arial"/>
+          <w:color w:val="1F1F1F"/>
+          <w:kern w:val="0"/>
+          <w:sz w:val="24"/>
+          <w:szCs w:val="24"/>
+          <w:lang w:eastAsia="pt-BR"/>
+          <w14:ligatures w14:val="none"/>
+        </w:rPr>
+        <w:t xml:space="preserve"> DESC;</w:t>
+      </w:r>
+    </w:p>
+    <w:p>
+      <w:pPr>
+        <w:pStyle w:val="PargrafodaLista"/>
+        <w:spacing w:after="0" w:line="420" w:lineRule="atLeast"/>
+        <w:rPr>
+          <w:rFonts w:ascii="Arial" w:eastAsia="Times New Roman" w:hAnsi="Arial" w:cs="Arial"/>
+          <w:color w:val="1F1F1F"/>
+          <w:kern w:val="0"/>
+          <w:sz w:val="24"/>
+          <w:szCs w:val="24"/>
+          <w:lang w:eastAsia="pt-BR"/>
+          <w14:ligatures w14:val="none"/>
+        </w:rPr>
+      </w:pPr>
+    </w:p>
+    <w:p>
+      <w:pPr>
+        <w:pStyle w:val="PargrafodaLista"/>
+        <w:numPr>
+          <w:ilvl w:val="0"/>
+          <w:numId w:val="3"/>
+        </w:numPr>
+        <w:spacing w:after="0" w:line="420" w:lineRule="atLeast"/>
         <w:rPr>
           <w:rFonts w:ascii="Arial" w:eastAsia="Times New Roman" w:hAnsi="Arial" w:cs="Arial"/>
           <w:b/>
@@ -183,27 +547,28 @@
           <w:kern w:val="0"/>
           <w:sz w:val="24"/>
           <w:szCs w:val="24"/>
-          <w:bdr w:val="none" w:sz="0" w:space="0" w:color="auto" w:frame="1"/>
-          <w:lang w:eastAsia="pt-BR"/>
-          <w14:ligatures w14:val="none"/>
-        </w:rPr>
-        <w:t>3.</w:t>
-      </w:r>
-      <w:r>
-        <w:rPr>
-          <w:rFonts w:ascii="Arial" w:eastAsia="Times New Roman" w:hAnsi="Arial" w:cs="Arial"/>
-          <w:color w:val="1F1F1F"/>
-          <w:kern w:val="0"/>
-          <w:sz w:val="24"/>
-          <w:szCs w:val="24"/>
-          <w:lang w:eastAsia="pt-BR"/>
-          <w14:ligatures w14:val="none"/>
-        </w:rPr>
-        <w:t xml:space="preserve"> Calcule o total de vendas por país e ordene os resultados do maior para o menor.</w:t>
+          <w:lang w:eastAsia="pt-BR"/>
+          <w14:ligatures w14:val="none"/>
+        </w:rPr>
+      </w:pPr>
+      <w:r>
+        <w:rPr>
+          <w:rFonts w:ascii="Arial" w:eastAsia="Times New Roman" w:hAnsi="Arial" w:cs="Arial"/>
+          <w:b/>
+          <w:bCs/>
+          <w:color w:val="1F1F1F"/>
+          <w:kern w:val="0"/>
+          <w:sz w:val="24"/>
+          <w:szCs w:val="24"/>
+          <w:lang w:eastAsia="pt-BR"/>
+          <w14:ligatures w14:val="none"/>
+        </w:rPr>
+        <w:t>Encontre a porcentagem de funcionários que ganham menos que R$ 5.000,00.</w:t>
       </w:r>
     </w:p>
     <w:p>
       <w:pPr>
+        <w:pStyle w:val="PargrafodaLista"/>
         <w:spacing w:after="0" w:line="420" w:lineRule="atLeast"/>
         <w:rPr>
           <w:rFonts w:ascii="Arial" w:eastAsia="Times New Roman" w:hAnsi="Arial" w:cs="Arial"/>
@@ -216,6 +581,145 @@
         </w:rPr>
       </w:pPr>
       <w:r>
+        <w:rPr>
+          <w:rFonts w:ascii="Arial" w:eastAsia="Times New Roman" w:hAnsi="Arial" w:cs="Arial"/>
+          <w:color w:val="1F1F1F"/>
+          <w:kern w:val="0"/>
+          <w:sz w:val="24"/>
+          <w:szCs w:val="24"/>
+          <w:lang w:eastAsia="pt-BR"/>
+          <w14:ligatures w14:val="none"/>
+        </w:rPr>
+        <w:t xml:space="preserve">SELECT (COUNT(f.id) * 100.0 / (SELECT </w:t>
+      </w:r>
+      <w:proofErr w:type="gramStart"/>
+      <w:r>
+        <w:rPr>
+          <w:rFonts w:ascii="Arial" w:eastAsia="Times New Roman" w:hAnsi="Arial" w:cs="Arial"/>
+          <w:color w:val="1F1F1F"/>
+          <w:kern w:val="0"/>
+          <w:sz w:val="24"/>
+          <w:szCs w:val="24"/>
+          <w:lang w:eastAsia="pt-BR"/>
+          <w14:ligatures w14:val="none"/>
+        </w:rPr>
+        <w:t>COUNT(</w:t>
+      </w:r>
+      <w:proofErr w:type="gramEnd"/>
+      <w:r>
+        <w:rPr>
+          <w:rFonts w:ascii="Arial" w:eastAsia="Times New Roman" w:hAnsi="Arial" w:cs="Arial"/>
+          <w:color w:val="1F1F1F"/>
+          <w:kern w:val="0"/>
+          <w:sz w:val="24"/>
+          <w:szCs w:val="24"/>
+          <w:lang w:eastAsia="pt-BR"/>
+          <w14:ligatures w14:val="none"/>
+        </w:rPr>
+        <w:t xml:space="preserve">*) FROM </w:t>
+      </w:r>
+      <w:proofErr w:type="spellStart"/>
+      <w:r>
+        <w:rPr>
+          <w:rFonts w:ascii="Arial" w:eastAsia="Times New Roman" w:hAnsi="Arial" w:cs="Arial"/>
+          <w:color w:val="1F1F1F"/>
+          <w:kern w:val="0"/>
+          <w:sz w:val="24"/>
+          <w:szCs w:val="24"/>
+          <w:lang w:eastAsia="pt-BR"/>
+          <w14:ligatures w14:val="none"/>
+        </w:rPr>
+        <w:t>funcionarios</w:t>
+      </w:r>
+      <w:proofErr w:type="spellEnd"/>
+      <w:r>
+        <w:rPr>
+          <w:rFonts w:ascii="Arial" w:eastAsia="Times New Roman" w:hAnsi="Arial" w:cs="Arial"/>
+          <w:color w:val="1F1F1F"/>
+          <w:kern w:val="0"/>
+          <w:sz w:val="24"/>
+          <w:szCs w:val="24"/>
+          <w:lang w:eastAsia="pt-BR"/>
+          <w14:ligatures w14:val="none"/>
+        </w:rPr>
+        <w:t xml:space="preserve">)) AS porcentagem FROM </w:t>
+      </w:r>
+      <w:proofErr w:type="spellStart"/>
+      <w:r>
+        <w:rPr>
+          <w:rFonts w:ascii="Arial" w:eastAsia="Times New Roman" w:hAnsi="Arial" w:cs="Arial"/>
+          <w:color w:val="1F1F1F"/>
+          <w:kern w:val="0"/>
+          <w:sz w:val="24"/>
+          <w:szCs w:val="24"/>
+          <w:lang w:eastAsia="pt-BR"/>
+          <w14:ligatures w14:val="none"/>
+        </w:rPr>
+        <w:t>funcionarios</w:t>
+      </w:r>
+      <w:proofErr w:type="spellEnd"/>
+      <w:r>
+        <w:rPr>
+          <w:rFonts w:ascii="Arial" w:eastAsia="Times New Roman" w:hAnsi="Arial" w:cs="Arial"/>
+          <w:color w:val="1F1F1F"/>
+          <w:kern w:val="0"/>
+          <w:sz w:val="24"/>
+          <w:szCs w:val="24"/>
+          <w:lang w:eastAsia="pt-BR"/>
+          <w14:ligatures w14:val="none"/>
+        </w:rPr>
+        <w:t xml:space="preserve"> f WHERE </w:t>
+      </w:r>
+      <w:proofErr w:type="spellStart"/>
+      <w:r>
+        <w:rPr>
+          <w:rFonts w:ascii="Arial" w:eastAsia="Times New Roman" w:hAnsi="Arial" w:cs="Arial"/>
+          <w:color w:val="1F1F1F"/>
+          <w:kern w:val="0"/>
+          <w:sz w:val="24"/>
+          <w:szCs w:val="24"/>
+          <w:lang w:eastAsia="pt-BR"/>
+          <w14:ligatures w14:val="none"/>
+        </w:rPr>
+        <w:t>f.salario</w:t>
+      </w:r>
+      <w:proofErr w:type="spellEnd"/>
+      <w:r>
+        <w:rPr>
+          <w:rFonts w:ascii="Arial" w:eastAsia="Times New Roman" w:hAnsi="Arial" w:cs="Arial"/>
+          <w:color w:val="1F1F1F"/>
+          <w:kern w:val="0"/>
+          <w:sz w:val="24"/>
+          <w:szCs w:val="24"/>
+          <w:lang w:eastAsia="pt-BR"/>
+          <w14:ligatures w14:val="none"/>
+        </w:rPr>
+        <w:t xml:space="preserve"> &lt; 5000;</w:t>
+      </w:r>
+    </w:p>
+    <w:p>
+      <w:pPr>
+        <w:pStyle w:val="PargrafodaLista"/>
+        <w:spacing w:after="0" w:line="420" w:lineRule="atLeast"/>
+        <w:rPr>
+          <w:rFonts w:ascii="Arial" w:eastAsia="Times New Roman" w:hAnsi="Arial" w:cs="Arial"/>
+          <w:color w:val="1F1F1F"/>
+          <w:kern w:val="0"/>
+          <w:sz w:val="24"/>
+          <w:szCs w:val="24"/>
+          <w:lang w:eastAsia="pt-BR"/>
+          <w14:ligatures w14:val="none"/>
+        </w:rPr>
+      </w:pPr>
+    </w:p>
+    <w:p>
+      <w:pPr>
+        <w:pStyle w:val="PargrafodaLista"/>
+        <w:numPr>
+          <w:ilvl w:val="0"/>
+          <w:numId w:val="3"/>
+        </w:numPr>
+        <w:spacing w:after="0" w:line="420" w:lineRule="atLeast"/>
         <w:rPr>
           <w:rFonts w:ascii="Arial" w:eastAsia="Times New Roman" w:hAnsi="Arial" w:cs="Arial"/>
           <w:b/>
@@ -224,27 +728,28 @@
           <w:kern w:val="0"/>
           <w:sz w:val="24"/>
           <w:szCs w:val="24"/>
-          <w:bdr w:val="none" w:sz="0" w:space="0" w:color="auto" w:frame="1"/>
-          <w:lang w:eastAsia="pt-BR"/>
-          <w14:ligatures w14:val="none"/>
-        </w:rPr>
-        <w:t>4.</w:t>
-      </w:r>
-      <w:r>
-        <w:rPr>
-          <w:rFonts w:ascii="Arial" w:eastAsia="Times New Roman" w:hAnsi="Arial" w:cs="Arial"/>
-          <w:color w:val="1F1F1F"/>
-          <w:kern w:val="0"/>
-          <w:sz w:val="24"/>
-          <w:szCs w:val="24"/>
-          <w:lang w:eastAsia="pt-BR"/>
-          <w14:ligatures w14:val="none"/>
-        </w:rPr>
-        <w:t xml:space="preserve"> Encontre a porcentagem de funcionários que ganham menos que R$ 5.000,00.</w:t>
+          <w:lang w:eastAsia="pt-BR"/>
+          <w14:ligatures w14:val="none"/>
+        </w:rPr>
+      </w:pPr>
+      <w:r>
+        <w:rPr>
+          <w:rFonts w:ascii="Arial" w:eastAsia="Times New Roman" w:hAnsi="Arial" w:cs="Arial"/>
+          <w:b/>
+          <w:bCs/>
+          <w:color w:val="1F1F1F"/>
+          <w:kern w:val="0"/>
+          <w:sz w:val="24"/>
+          <w:szCs w:val="24"/>
+          <w:lang w:eastAsia="pt-BR"/>
+          <w14:ligatures w14:val="none"/>
+        </w:rPr>
+        <w:t>Liste os departamentos com mais de 10 funcionários e a média salarial de cada um.</w:t>
       </w:r>
     </w:p>
     <w:p>
       <w:pPr>
+        <w:pStyle w:val="PargrafodaLista"/>
         <w:spacing w:after="0" w:line="420" w:lineRule="atLeast"/>
         <w:rPr>
           <w:rFonts w:ascii="Arial" w:eastAsia="Times New Roman" w:hAnsi="Arial" w:cs="Arial"/>
@@ -257,6 +762,240 @@
         </w:rPr>
       </w:pPr>
       <w:r>
+        <w:rPr>
+          <w:rFonts w:ascii="Arial" w:eastAsia="Times New Roman" w:hAnsi="Arial" w:cs="Arial"/>
+          <w:color w:val="1F1F1F"/>
+          <w:kern w:val="0"/>
+          <w:sz w:val="24"/>
+          <w:szCs w:val="24"/>
+          <w:lang w:eastAsia="pt-BR"/>
+          <w14:ligatures w14:val="none"/>
+        </w:rPr>
+        <w:t xml:space="preserve">SELECT </w:t>
+      </w:r>
+      <w:proofErr w:type="spellStart"/>
+      <w:proofErr w:type="gramStart"/>
+      <w:r>
+        <w:rPr>
+          <w:rFonts w:ascii="Arial" w:eastAsia="Times New Roman" w:hAnsi="Arial" w:cs="Arial"/>
+          <w:color w:val="1F1F1F"/>
+          <w:kern w:val="0"/>
+          <w:sz w:val="24"/>
+          <w:szCs w:val="24"/>
+          <w:lang w:eastAsia="pt-BR"/>
+          <w14:ligatures w14:val="none"/>
+        </w:rPr>
+        <w:t>d.nome</w:t>
+      </w:r>
+      <w:proofErr w:type="spellEnd"/>
+      <w:proofErr w:type="gramEnd"/>
+      <w:r>
+        <w:rPr>
+          <w:rFonts w:ascii="Arial" w:eastAsia="Times New Roman" w:hAnsi="Arial" w:cs="Arial"/>
+          <w:color w:val="1F1F1F"/>
+          <w:kern w:val="0"/>
+          <w:sz w:val="24"/>
+          <w:szCs w:val="24"/>
+          <w:lang w:eastAsia="pt-BR"/>
+          <w14:ligatures w14:val="none"/>
+        </w:rPr>
+        <w:t xml:space="preserve">, COUNT(f.id) AS </w:t>
+      </w:r>
+      <w:proofErr w:type="spellStart"/>
+      <w:r>
+        <w:rPr>
+          <w:rFonts w:ascii="Arial" w:eastAsia="Times New Roman" w:hAnsi="Arial" w:cs="Arial"/>
+          <w:color w:val="1F1F1F"/>
+          <w:kern w:val="0"/>
+          <w:sz w:val="24"/>
+          <w:szCs w:val="24"/>
+          <w:lang w:eastAsia="pt-BR"/>
+          <w14:ligatures w14:val="none"/>
+        </w:rPr>
+        <w:t>num_funcionarios</w:t>
+      </w:r>
+      <w:proofErr w:type="spellEnd"/>
+      <w:r>
+        <w:rPr>
+          <w:rFonts w:ascii="Arial" w:eastAsia="Times New Roman" w:hAnsi="Arial" w:cs="Arial"/>
+          <w:color w:val="1F1F1F"/>
+          <w:kern w:val="0"/>
+          <w:sz w:val="24"/>
+          <w:szCs w:val="24"/>
+          <w:lang w:eastAsia="pt-BR"/>
+          <w14:ligatures w14:val="none"/>
+        </w:rPr>
+        <w:t>, AVG(</w:t>
+      </w:r>
+      <w:proofErr w:type="spellStart"/>
+      <w:r>
+        <w:rPr>
+          <w:rFonts w:ascii="Arial" w:eastAsia="Times New Roman" w:hAnsi="Arial" w:cs="Arial"/>
+          <w:color w:val="1F1F1F"/>
+          <w:kern w:val="0"/>
+          <w:sz w:val="24"/>
+          <w:szCs w:val="24"/>
+          <w:lang w:eastAsia="pt-BR"/>
+          <w14:ligatures w14:val="none"/>
+        </w:rPr>
+        <w:t>f.salario</w:t>
+      </w:r>
+      <w:proofErr w:type="spellEnd"/>
+      <w:r>
+        <w:rPr>
+          <w:rFonts w:ascii="Arial" w:eastAsia="Times New Roman" w:hAnsi="Arial" w:cs="Arial"/>
+          <w:color w:val="1F1F1F"/>
+          <w:kern w:val="0"/>
+          <w:sz w:val="24"/>
+          <w:szCs w:val="24"/>
+          <w:lang w:eastAsia="pt-BR"/>
+          <w14:ligatures w14:val="none"/>
+        </w:rPr>
+        <w:t xml:space="preserve">) AS </w:t>
+      </w:r>
+      <w:proofErr w:type="spellStart"/>
+      <w:r>
+        <w:rPr>
+          <w:rFonts w:ascii="Arial" w:eastAsia="Times New Roman" w:hAnsi="Arial" w:cs="Arial"/>
+          <w:color w:val="1F1F1F"/>
+          <w:kern w:val="0"/>
+          <w:sz w:val="24"/>
+          <w:szCs w:val="24"/>
+          <w:lang w:eastAsia="pt-BR"/>
+          <w14:ligatures w14:val="none"/>
+        </w:rPr>
+        <w:t>media_salarial</w:t>
+      </w:r>
+      <w:proofErr w:type="spellEnd"/>
+      <w:r>
+        <w:rPr>
+          <w:rFonts w:ascii="Arial" w:eastAsia="Times New Roman" w:hAnsi="Arial" w:cs="Arial"/>
+          <w:color w:val="1F1F1F"/>
+          <w:kern w:val="0"/>
+          <w:sz w:val="24"/>
+          <w:szCs w:val="24"/>
+          <w:lang w:eastAsia="pt-BR"/>
+          <w14:ligatures w14:val="none"/>
+        </w:rPr>
+        <w:t xml:space="preserve"> FROM departamentos d INNER JOIN </w:t>
+      </w:r>
+      <w:proofErr w:type="spellStart"/>
+      <w:r>
+        <w:rPr>
+          <w:rFonts w:ascii="Arial" w:eastAsia="Times New Roman" w:hAnsi="Arial" w:cs="Arial"/>
+          <w:color w:val="1F1F1F"/>
+          <w:kern w:val="0"/>
+          <w:sz w:val="24"/>
+          <w:szCs w:val="24"/>
+          <w:lang w:eastAsia="pt-BR"/>
+          <w14:ligatures w14:val="none"/>
+        </w:rPr>
+        <w:t>funcionarios</w:t>
+      </w:r>
+      <w:proofErr w:type="spellEnd"/>
+      <w:r>
+        <w:rPr>
+          <w:rFonts w:ascii="Arial" w:eastAsia="Times New Roman" w:hAnsi="Arial" w:cs="Arial"/>
+          <w:color w:val="1F1F1F"/>
+          <w:kern w:val="0"/>
+          <w:sz w:val="24"/>
+          <w:szCs w:val="24"/>
+          <w:lang w:eastAsia="pt-BR"/>
+          <w14:ligatures w14:val="none"/>
+        </w:rPr>
+        <w:t xml:space="preserve"> f ON d.id = </w:t>
+      </w:r>
+      <w:proofErr w:type="spellStart"/>
+      <w:r>
+        <w:rPr>
+          <w:rFonts w:ascii="Arial" w:eastAsia="Times New Roman" w:hAnsi="Arial" w:cs="Arial"/>
+          <w:color w:val="1F1F1F"/>
+          <w:kern w:val="0"/>
+          <w:sz w:val="24"/>
+          <w:szCs w:val="24"/>
+          <w:lang w:eastAsia="pt-BR"/>
+          <w14:ligatures w14:val="none"/>
+        </w:rPr>
+        <w:t>f.departamento_id</w:t>
+      </w:r>
+      <w:proofErr w:type="spellEnd"/>
+      <w:r>
+        <w:rPr>
+          <w:rFonts w:ascii="Arial" w:eastAsia="Times New Roman" w:hAnsi="Arial" w:cs="Arial"/>
+          <w:color w:val="1F1F1F"/>
+          <w:kern w:val="0"/>
+          <w:sz w:val="24"/>
+          <w:szCs w:val="24"/>
+          <w:lang w:eastAsia="pt-BR"/>
+          <w14:ligatures w14:val="none"/>
+        </w:rPr>
+        <w:t xml:space="preserve"> GROUP BY </w:t>
+      </w:r>
+      <w:proofErr w:type="spellStart"/>
+      <w:r>
+        <w:rPr>
+          <w:rFonts w:ascii="Arial" w:eastAsia="Times New Roman" w:hAnsi="Arial" w:cs="Arial"/>
+          <w:color w:val="1F1F1F"/>
+          <w:kern w:val="0"/>
+          <w:sz w:val="24"/>
+          <w:szCs w:val="24"/>
+          <w:lang w:eastAsia="pt-BR"/>
+          <w14:ligatures w14:val="none"/>
+        </w:rPr>
+        <w:t>d.nome</w:t>
+      </w:r>
+      <w:proofErr w:type="spellEnd"/>
+      <w:r>
+        <w:rPr>
+          <w:rFonts w:ascii="Arial" w:eastAsia="Times New Roman" w:hAnsi="Arial" w:cs="Arial"/>
+          <w:color w:val="1F1F1F"/>
+          <w:kern w:val="0"/>
+          <w:sz w:val="24"/>
+          <w:szCs w:val="24"/>
+          <w:lang w:eastAsia="pt-BR"/>
+          <w14:ligatures w14:val="none"/>
+        </w:rPr>
+        <w:t xml:space="preserve"> HAVING COUNT(f.id) &gt; 10;</w:t>
+      </w:r>
+    </w:p>
+    <w:p>
+      <w:pPr>
+        <w:pStyle w:val="PargrafodaLista"/>
+        <w:spacing w:after="0" w:line="420" w:lineRule="atLeast"/>
+        <w:rPr>
+          <w:rFonts w:ascii="Arial" w:eastAsia="Times New Roman" w:hAnsi="Arial" w:cs="Arial"/>
+          <w:color w:val="1F1F1F"/>
+          <w:kern w:val="0"/>
+          <w:sz w:val="24"/>
+          <w:szCs w:val="24"/>
+          <w:lang w:eastAsia="pt-BR"/>
+          <w14:ligatures w14:val="none"/>
+        </w:rPr>
+      </w:pPr>
+    </w:p>
+    <w:p>
+      <w:pPr>
+        <w:pStyle w:val="PargrafodaLista"/>
+        <w:spacing w:after="0" w:line="420" w:lineRule="atLeast"/>
+        <w:rPr>
+          <w:rFonts w:ascii="Arial" w:eastAsia="Times New Roman" w:hAnsi="Arial" w:cs="Arial"/>
+          <w:color w:val="1F1F1F"/>
+          <w:kern w:val="0"/>
+          <w:sz w:val="24"/>
+          <w:szCs w:val="24"/>
+          <w:lang w:eastAsia="pt-BR"/>
+          <w14:ligatures w14:val="none"/>
+        </w:rPr>
+      </w:pPr>
+    </w:p>
+    <w:p>
+      <w:pPr>
+        <w:pStyle w:val="PargrafodaLista"/>
+        <w:numPr>
+          <w:ilvl w:val="0"/>
+          <w:numId w:val="3"/>
+        </w:numPr>
+        <w:spacing w:after="0" w:line="420" w:lineRule="atLeast"/>
         <w:rPr>
           <w:rFonts w:ascii="Arial" w:eastAsia="Times New Roman" w:hAnsi="Arial" w:cs="Arial"/>
           <w:b/>
@@ -265,27 +1004,29 @@
           <w:kern w:val="0"/>
           <w:sz w:val="24"/>
           <w:szCs w:val="24"/>
-          <w:bdr w:val="none" w:sz="0" w:space="0" w:color="auto" w:frame="1"/>
-          <w:lang w:eastAsia="pt-BR"/>
-          <w14:ligatures w14:val="none"/>
-        </w:rPr>
-        <w:t>5.</w:t>
-      </w:r>
-      <w:r>
-        <w:rPr>
-          <w:rFonts w:ascii="Arial" w:eastAsia="Times New Roman" w:hAnsi="Arial" w:cs="Arial"/>
-          <w:color w:val="1F1F1F"/>
-          <w:kern w:val="0"/>
-          <w:sz w:val="24"/>
-          <w:szCs w:val="24"/>
-          <w:lang w:eastAsia="pt-BR"/>
-          <w14:ligatures w14:val="none"/>
-        </w:rPr>
-        <w:t xml:space="preserve"> Liste os departamentos com mais de 10 funcionários e a média salarial de cada um.</w:t>
+          <w:lang w:eastAsia="pt-BR"/>
+          <w14:ligatures w14:val="none"/>
+        </w:rPr>
+      </w:pPr>
+      <w:r>
+        <w:rPr>
+          <w:rFonts w:ascii="Arial" w:eastAsia="Times New Roman" w:hAnsi="Arial" w:cs="Arial"/>
+          <w:b/>
+          <w:bCs/>
+          <w:color w:val="1F1F1F"/>
+          <w:kern w:val="0"/>
+          <w:sz w:val="24"/>
+          <w:szCs w:val="24"/>
+          <w:lang w:eastAsia="pt-BR"/>
+          <w14:ligatures w14:val="none"/>
+        </w:rPr>
+        <w:lastRenderedPageBreak/>
+        <w:t>Encontre a diferença de idade entre o funcionário mais velho e o mais novo da empresa.</w:t>
       </w:r>
     </w:p>
     <w:p>
       <w:pPr>
+        <w:pStyle w:val="PargrafodaLista"/>
         <w:spacing w:after="0" w:line="420" w:lineRule="atLeast"/>
         <w:rPr>
           <w:rFonts w:ascii="Arial" w:eastAsia="Times New Roman" w:hAnsi="Arial" w:cs="Arial"/>
@@ -298,6 +1039,147 @@
         </w:rPr>
       </w:pPr>
       <w:r>
+        <w:rPr>
+          <w:rFonts w:ascii="Arial" w:eastAsia="Times New Roman" w:hAnsi="Arial" w:cs="Arial"/>
+          <w:color w:val="1F1F1F"/>
+          <w:kern w:val="0"/>
+          <w:sz w:val="24"/>
+          <w:szCs w:val="24"/>
+          <w:lang w:eastAsia="pt-BR"/>
+          <w14:ligatures w14:val="none"/>
+        </w:rPr>
+        <w:t>SELECT MAX(</w:t>
+      </w:r>
+      <w:proofErr w:type="spellStart"/>
+      <w:proofErr w:type="gramStart"/>
+      <w:r>
+        <w:rPr>
+          <w:rFonts w:ascii="Arial" w:eastAsia="Times New Roman" w:hAnsi="Arial" w:cs="Arial"/>
+          <w:color w:val="1F1F1F"/>
+          <w:kern w:val="0"/>
+          <w:sz w:val="24"/>
+          <w:szCs w:val="24"/>
+          <w:lang w:eastAsia="pt-BR"/>
+          <w14:ligatures w14:val="none"/>
+        </w:rPr>
+        <w:t>f.idade</w:t>
+      </w:r>
+      <w:proofErr w:type="spellEnd"/>
+      <w:proofErr w:type="gramEnd"/>
+      <w:r>
+        <w:rPr>
+          <w:rFonts w:ascii="Arial" w:eastAsia="Times New Roman" w:hAnsi="Arial" w:cs="Arial"/>
+          <w:color w:val="1F1F1F"/>
+          <w:kern w:val="0"/>
+          <w:sz w:val="24"/>
+          <w:szCs w:val="24"/>
+          <w:lang w:eastAsia="pt-BR"/>
+          <w14:ligatures w14:val="none"/>
+        </w:rPr>
+        <w:t>) - MIN(</w:t>
+      </w:r>
+      <w:proofErr w:type="spellStart"/>
+      <w:r>
+        <w:rPr>
+          <w:rFonts w:ascii="Arial" w:eastAsia="Times New Roman" w:hAnsi="Arial" w:cs="Arial"/>
+          <w:color w:val="1F1F1F"/>
+          <w:kern w:val="0"/>
+          <w:sz w:val="24"/>
+          <w:szCs w:val="24"/>
+          <w:lang w:eastAsia="pt-BR"/>
+          <w14:ligatures w14:val="none"/>
+        </w:rPr>
+        <w:t>f.idade</w:t>
+      </w:r>
+      <w:proofErr w:type="spellEnd"/>
+      <w:r>
+        <w:rPr>
+          <w:rFonts w:ascii="Arial" w:eastAsia="Times New Roman" w:hAnsi="Arial" w:cs="Arial"/>
+          <w:color w:val="1F1F1F"/>
+          <w:kern w:val="0"/>
+          <w:sz w:val="24"/>
+          <w:szCs w:val="24"/>
+          <w:lang w:eastAsia="pt-BR"/>
+          <w14:ligatures w14:val="none"/>
+        </w:rPr>
+        <w:t xml:space="preserve">) AS </w:t>
+      </w:r>
+      <w:proofErr w:type="spellStart"/>
+      <w:r>
+        <w:rPr>
+          <w:rFonts w:ascii="Arial" w:eastAsia="Times New Roman" w:hAnsi="Arial" w:cs="Arial"/>
+          <w:color w:val="1F1F1F"/>
+          <w:kern w:val="0"/>
+          <w:sz w:val="24"/>
+          <w:szCs w:val="24"/>
+          <w:lang w:eastAsia="pt-BR"/>
+          <w14:ligatures w14:val="none"/>
+        </w:rPr>
+        <w:t>diferenca_idade</w:t>
+      </w:r>
+      <w:proofErr w:type="spellEnd"/>
+      <w:r>
+        <w:rPr>
+          <w:rFonts w:ascii="Arial" w:eastAsia="Times New Roman" w:hAnsi="Arial" w:cs="Arial"/>
+          <w:color w:val="1F1F1F"/>
+          <w:kern w:val="0"/>
+          <w:sz w:val="24"/>
+          <w:szCs w:val="24"/>
+          <w:lang w:eastAsia="pt-BR"/>
+          <w14:ligatures w14:val="none"/>
+        </w:rPr>
+        <w:t xml:space="preserve"> FROM </w:t>
+      </w:r>
+      <w:proofErr w:type="spellStart"/>
+      <w:r>
+        <w:rPr>
+          <w:rFonts w:ascii="Arial" w:eastAsia="Times New Roman" w:hAnsi="Arial" w:cs="Arial"/>
+          <w:color w:val="1F1F1F"/>
+          <w:kern w:val="0"/>
+          <w:sz w:val="24"/>
+          <w:szCs w:val="24"/>
+          <w:lang w:eastAsia="pt-BR"/>
+          <w14:ligatures w14:val="none"/>
+        </w:rPr>
+        <w:t>funcionarios</w:t>
+      </w:r>
+      <w:proofErr w:type="spellEnd"/>
+      <w:r>
+        <w:rPr>
+          <w:rFonts w:ascii="Arial" w:eastAsia="Times New Roman" w:hAnsi="Arial" w:cs="Arial"/>
+          <w:color w:val="1F1F1F"/>
+          <w:kern w:val="0"/>
+          <w:sz w:val="24"/>
+          <w:szCs w:val="24"/>
+          <w:lang w:eastAsia="pt-BR"/>
+          <w14:ligatures w14:val="none"/>
+        </w:rPr>
+        <w:t xml:space="preserve"> f;</w:t>
+      </w:r>
+    </w:p>
+    <w:p>
+      <w:pPr>
+        <w:pStyle w:val="PargrafodaLista"/>
+        <w:spacing w:after="0" w:line="420" w:lineRule="atLeast"/>
+        <w:rPr>
+          <w:rFonts w:ascii="Arial" w:eastAsia="Times New Roman" w:hAnsi="Arial" w:cs="Arial"/>
+          <w:color w:val="1F1F1F"/>
+          <w:kern w:val="0"/>
+          <w:sz w:val="24"/>
+          <w:szCs w:val="24"/>
+          <w:lang w:eastAsia="pt-BR"/>
+          <w14:ligatures w14:val="none"/>
+        </w:rPr>
+      </w:pPr>
+    </w:p>
+    <w:p>
+      <w:pPr>
+        <w:pStyle w:val="PargrafodaLista"/>
+        <w:numPr>
+          <w:ilvl w:val="0"/>
+          <w:numId w:val="3"/>
+        </w:numPr>
+        <w:spacing w:after="0" w:line="420" w:lineRule="atLeast"/>
         <w:rPr>
           <w:rFonts w:ascii="Arial" w:eastAsia="Times New Roman" w:hAnsi="Arial" w:cs="Arial"/>
           <w:b/>
@@ -306,27 +1188,28 @@
           <w:kern w:val="0"/>
           <w:sz w:val="24"/>
           <w:szCs w:val="24"/>
-          <w:bdr w:val="none" w:sz="0" w:space="0" w:color="auto" w:frame="1"/>
-          <w:lang w:eastAsia="pt-BR"/>
-          <w14:ligatures w14:val="none"/>
-        </w:rPr>
-        <w:t>6.</w:t>
-      </w:r>
-      <w:r>
-        <w:rPr>
-          <w:rFonts w:ascii="Arial" w:eastAsia="Times New Roman" w:hAnsi="Arial" w:cs="Arial"/>
-          <w:color w:val="1F1F1F"/>
-          <w:kern w:val="0"/>
-          <w:sz w:val="24"/>
-          <w:szCs w:val="24"/>
-          <w:lang w:eastAsia="pt-BR"/>
-          <w14:ligatures w14:val="none"/>
-        </w:rPr>
-        <w:t xml:space="preserve"> Encontre a diferença de idade entre o funcionário mais velho e o mais novo da empresa.</w:t>
+          <w:lang w:eastAsia="pt-BR"/>
+          <w14:ligatures w14:val="none"/>
+        </w:rPr>
+      </w:pPr>
+      <w:r>
+        <w:rPr>
+          <w:rFonts w:ascii="Arial" w:eastAsia="Times New Roman" w:hAnsi="Arial" w:cs="Arial"/>
+          <w:b/>
+          <w:bCs/>
+          <w:color w:val="1F1F1F"/>
+          <w:kern w:val="0"/>
+          <w:sz w:val="24"/>
+          <w:szCs w:val="24"/>
+          <w:lang w:eastAsia="pt-BR"/>
+          <w14:ligatures w14:val="none"/>
+        </w:rPr>
+        <w:t>Liste os nomes dos funcionários que estão no departamento "IT" há mais de 3 anos e ganham mais que R$ 7.000,00.</w:t>
       </w:r>
     </w:p>
     <w:p>
       <w:pPr>
+        <w:pStyle w:val="PargrafodaLista"/>
         <w:spacing w:after="0" w:line="420" w:lineRule="atLeast"/>
         <w:rPr>
           <w:rFonts w:ascii="Arial" w:eastAsia="Times New Roman" w:hAnsi="Arial" w:cs="Arial"/>
@@ -339,6 +1222,199 @@
         </w:rPr>
       </w:pPr>
       <w:r>
+        <w:rPr>
+          <w:rFonts w:ascii="Arial" w:eastAsia="Times New Roman" w:hAnsi="Arial" w:cs="Arial"/>
+          <w:color w:val="1F1F1F"/>
+          <w:kern w:val="0"/>
+          <w:sz w:val="24"/>
+          <w:szCs w:val="24"/>
+          <w:lang w:eastAsia="pt-BR"/>
+          <w14:ligatures w14:val="none"/>
+        </w:rPr>
+        <w:t xml:space="preserve">SELECT </w:t>
+      </w:r>
+      <w:proofErr w:type="spellStart"/>
+      <w:proofErr w:type="gramStart"/>
+      <w:r>
+        <w:rPr>
+          <w:rFonts w:ascii="Arial" w:eastAsia="Times New Roman" w:hAnsi="Arial" w:cs="Arial"/>
+          <w:color w:val="1F1F1F"/>
+          <w:kern w:val="0"/>
+          <w:sz w:val="24"/>
+          <w:szCs w:val="24"/>
+          <w:lang w:eastAsia="pt-BR"/>
+          <w14:ligatures w14:val="none"/>
+        </w:rPr>
+        <w:t>f.nome</w:t>
+      </w:r>
+      <w:proofErr w:type="spellEnd"/>
+      <w:proofErr w:type="gramEnd"/>
+      <w:r>
+        <w:rPr>
+          <w:rFonts w:ascii="Arial" w:eastAsia="Times New Roman" w:hAnsi="Arial" w:cs="Arial"/>
+          <w:color w:val="1F1F1F"/>
+          <w:kern w:val="0"/>
+          <w:sz w:val="24"/>
+          <w:szCs w:val="24"/>
+          <w:lang w:eastAsia="pt-BR"/>
+          <w14:ligatures w14:val="none"/>
+        </w:rPr>
+        <w:t xml:space="preserve"> FROM </w:t>
+      </w:r>
+      <w:proofErr w:type="spellStart"/>
+      <w:r>
+        <w:rPr>
+          <w:rFonts w:ascii="Arial" w:eastAsia="Times New Roman" w:hAnsi="Arial" w:cs="Arial"/>
+          <w:color w:val="1F1F1F"/>
+          <w:kern w:val="0"/>
+          <w:sz w:val="24"/>
+          <w:szCs w:val="24"/>
+          <w:lang w:eastAsia="pt-BR"/>
+          <w14:ligatures w14:val="none"/>
+        </w:rPr>
+        <w:t>funcionarios</w:t>
+      </w:r>
+      <w:proofErr w:type="spellEnd"/>
+      <w:r>
+        <w:rPr>
+          <w:rFonts w:ascii="Arial" w:eastAsia="Times New Roman" w:hAnsi="Arial" w:cs="Arial"/>
+          <w:color w:val="1F1F1F"/>
+          <w:kern w:val="0"/>
+          <w:sz w:val="24"/>
+          <w:szCs w:val="24"/>
+          <w:lang w:eastAsia="pt-BR"/>
+          <w14:ligatures w14:val="none"/>
+        </w:rPr>
+        <w:t xml:space="preserve"> f INNER JOIN departamentos d ON </w:t>
+      </w:r>
+      <w:proofErr w:type="spellStart"/>
+      <w:r>
+        <w:rPr>
+          <w:rFonts w:ascii="Arial" w:eastAsia="Times New Roman" w:hAnsi="Arial" w:cs="Arial"/>
+          <w:color w:val="1F1F1F"/>
+          <w:kern w:val="0"/>
+          <w:sz w:val="24"/>
+          <w:szCs w:val="24"/>
+          <w:lang w:eastAsia="pt-BR"/>
+          <w14:ligatures w14:val="none"/>
+        </w:rPr>
+        <w:t>f.departamento_id</w:t>
+      </w:r>
+      <w:proofErr w:type="spellEnd"/>
+      <w:r>
+        <w:rPr>
+          <w:rFonts w:ascii="Arial" w:eastAsia="Times New Roman" w:hAnsi="Arial" w:cs="Arial"/>
+          <w:color w:val="1F1F1F"/>
+          <w:kern w:val="0"/>
+          <w:sz w:val="24"/>
+          <w:szCs w:val="24"/>
+          <w:lang w:eastAsia="pt-BR"/>
+          <w14:ligatures w14:val="none"/>
+        </w:rPr>
+        <w:t xml:space="preserve"> = d.id WHERE </w:t>
+      </w:r>
+      <w:proofErr w:type="spellStart"/>
+      <w:r>
+        <w:rPr>
+          <w:rFonts w:ascii="Arial" w:eastAsia="Times New Roman" w:hAnsi="Arial" w:cs="Arial"/>
+          <w:color w:val="1F1F1F"/>
+          <w:kern w:val="0"/>
+          <w:sz w:val="24"/>
+          <w:szCs w:val="24"/>
+          <w:lang w:eastAsia="pt-BR"/>
+          <w14:ligatures w14:val="none"/>
+        </w:rPr>
+        <w:t>d.nome</w:t>
+      </w:r>
+      <w:proofErr w:type="spellEnd"/>
+      <w:r>
+        <w:rPr>
+          <w:rFonts w:ascii="Arial" w:eastAsia="Times New Roman" w:hAnsi="Arial" w:cs="Arial"/>
+          <w:color w:val="1F1F1F"/>
+          <w:kern w:val="0"/>
+          <w:sz w:val="24"/>
+          <w:szCs w:val="24"/>
+          <w:lang w:eastAsia="pt-BR"/>
+          <w14:ligatures w14:val="none"/>
+        </w:rPr>
+        <w:t xml:space="preserve"> = 'IT' AND </w:t>
+      </w:r>
+      <w:proofErr w:type="spellStart"/>
+      <w:r>
+        <w:rPr>
+          <w:rFonts w:ascii="Arial" w:eastAsia="Times New Roman" w:hAnsi="Arial" w:cs="Arial"/>
+          <w:color w:val="1F1F1F"/>
+          <w:kern w:val="0"/>
+          <w:sz w:val="24"/>
+          <w:szCs w:val="24"/>
+          <w:lang w:eastAsia="pt-BR"/>
+          <w14:ligatures w14:val="none"/>
+        </w:rPr>
+        <w:t>f.anos_experiencia</w:t>
+      </w:r>
+      <w:proofErr w:type="spellEnd"/>
+      <w:r>
+        <w:rPr>
+          <w:rFonts w:ascii="Arial" w:eastAsia="Times New Roman" w:hAnsi="Arial" w:cs="Arial"/>
+          <w:color w:val="1F1F1F"/>
+          <w:kern w:val="0"/>
+          <w:sz w:val="24"/>
+          <w:szCs w:val="24"/>
+          <w:lang w:eastAsia="pt-BR"/>
+          <w14:ligatures w14:val="none"/>
+        </w:rPr>
+        <w:t xml:space="preserve"> &gt; 3 AND </w:t>
+      </w:r>
+      <w:proofErr w:type="spellStart"/>
+      <w:r>
+        <w:rPr>
+          <w:rFonts w:ascii="Arial" w:eastAsia="Times New Roman" w:hAnsi="Arial" w:cs="Arial"/>
+          <w:color w:val="1F1F1F"/>
+          <w:kern w:val="0"/>
+          <w:sz w:val="24"/>
+          <w:szCs w:val="24"/>
+          <w:lang w:eastAsia="pt-BR"/>
+          <w14:ligatures w14:val="none"/>
+        </w:rPr>
+        <w:t>f.salario</w:t>
+      </w:r>
+      <w:proofErr w:type="spellEnd"/>
+      <w:r>
+        <w:rPr>
+          <w:rFonts w:ascii="Arial" w:eastAsia="Times New Roman" w:hAnsi="Arial" w:cs="Arial"/>
+          <w:color w:val="1F1F1F"/>
+          <w:kern w:val="0"/>
+          <w:sz w:val="24"/>
+          <w:szCs w:val="24"/>
+          <w:lang w:eastAsia="pt-BR"/>
+          <w14:ligatures w14:val="none"/>
+        </w:rPr>
+        <w:t xml:space="preserve"> &gt; 7000;</w:t>
+      </w:r>
+    </w:p>
+    <w:p>
+      <w:pPr>
+        <w:pStyle w:val="PargrafodaLista"/>
+        <w:spacing w:after="0" w:line="420" w:lineRule="atLeast"/>
+        <w:rPr>
+          <w:rFonts w:ascii="Arial" w:eastAsia="Times New Roman" w:hAnsi="Arial" w:cs="Arial"/>
+          <w:color w:val="1F1F1F"/>
+          <w:kern w:val="0"/>
+          <w:sz w:val="24"/>
+          <w:szCs w:val="24"/>
+          <w:lang w:eastAsia="pt-BR"/>
+          <w14:ligatures w14:val="none"/>
+        </w:rPr>
+      </w:pPr>
+    </w:p>
+    <w:p>
+      <w:pPr>
+        <w:pStyle w:val="PargrafodaLista"/>
+        <w:numPr>
+          <w:ilvl w:val="0"/>
+          <w:numId w:val="3"/>
+        </w:numPr>
+        <w:spacing w:after="0" w:line="420" w:lineRule="atLeast"/>
         <w:rPr>
           <w:rFonts w:ascii="Arial" w:eastAsia="Times New Roman" w:hAnsi="Arial" w:cs="Arial"/>
           <w:b/>
@@ -347,27 +1423,28 @@
           <w:kern w:val="0"/>
           <w:sz w:val="24"/>
           <w:szCs w:val="24"/>
-          <w:bdr w:val="none" w:sz="0" w:space="0" w:color="auto" w:frame="1"/>
-          <w:lang w:eastAsia="pt-BR"/>
-          <w14:ligatures w14:val="none"/>
-        </w:rPr>
-        <w:t>7.</w:t>
-      </w:r>
-      <w:r>
-        <w:rPr>
-          <w:rFonts w:ascii="Arial" w:eastAsia="Times New Roman" w:hAnsi="Arial" w:cs="Arial"/>
-          <w:color w:val="1F1F1F"/>
-          <w:kern w:val="0"/>
-          <w:sz w:val="24"/>
-          <w:szCs w:val="24"/>
-          <w:lang w:eastAsia="pt-BR"/>
-          <w14:ligatures w14:val="none"/>
-        </w:rPr>
-        <w:t xml:space="preserve"> Liste os nomes dos funcionários que estão no departamento "IT" há mais de 3 anos e ganham mais que R$ 7.000,00.</w:t>
+          <w:lang w:eastAsia="pt-BR"/>
+          <w14:ligatures w14:val="none"/>
+        </w:rPr>
+      </w:pPr>
+      <w:r>
+        <w:rPr>
+          <w:rFonts w:ascii="Arial" w:eastAsia="Times New Roman" w:hAnsi="Arial" w:cs="Arial"/>
+          <w:b/>
+          <w:bCs/>
+          <w:color w:val="1F1F1F"/>
+          <w:kern w:val="0"/>
+          <w:sz w:val="24"/>
+          <w:szCs w:val="24"/>
+          <w:lang w:eastAsia="pt-BR"/>
+          <w14:ligatures w14:val="none"/>
+        </w:rPr>
+        <w:t>Calcule o total de vendas por mês e ano e identifique o mês com o maior volume de vendas.</w:t>
       </w:r>
     </w:p>
     <w:p>
       <w:pPr>
+        <w:pStyle w:val="PargrafodaLista"/>
         <w:spacing w:after="0" w:line="420" w:lineRule="atLeast"/>
         <w:rPr>
           <w:rFonts w:ascii="Arial" w:eastAsia="Times New Roman" w:hAnsi="Arial" w:cs="Arial"/>
@@ -380,6 +1457,263 @@
         </w:rPr>
       </w:pPr>
       <w:r>
+        <w:rPr>
+          <w:rFonts w:ascii="Arial" w:eastAsia="Times New Roman" w:hAnsi="Arial" w:cs="Arial"/>
+          <w:color w:val="1F1F1F"/>
+          <w:kern w:val="0"/>
+          <w:sz w:val="24"/>
+          <w:szCs w:val="24"/>
+          <w:lang w:eastAsia="pt-BR"/>
+          <w14:ligatures w14:val="none"/>
+        </w:rPr>
+        <w:t>SELECT YEAR(</w:t>
+      </w:r>
+      <w:proofErr w:type="spellStart"/>
+      <w:r>
+        <w:rPr>
+          <w:rFonts w:ascii="Arial" w:eastAsia="Times New Roman" w:hAnsi="Arial" w:cs="Arial"/>
+          <w:color w:val="1F1F1F"/>
+          <w:kern w:val="0"/>
+          <w:sz w:val="24"/>
+          <w:szCs w:val="24"/>
+          <w:lang w:eastAsia="pt-BR"/>
+          <w14:ligatures w14:val="none"/>
+        </w:rPr>
+        <w:t>v.data_venda</w:t>
+      </w:r>
+      <w:proofErr w:type="spellEnd"/>
+      <w:r>
+        <w:rPr>
+          <w:rFonts w:ascii="Arial" w:eastAsia="Times New Roman" w:hAnsi="Arial" w:cs="Arial"/>
+          <w:color w:val="1F1F1F"/>
+          <w:kern w:val="0"/>
+          <w:sz w:val="24"/>
+          <w:szCs w:val="24"/>
+          <w:lang w:eastAsia="pt-BR"/>
+          <w14:ligatures w14:val="none"/>
+        </w:rPr>
+        <w:t>) AS ano, MONTH(</w:t>
+      </w:r>
+      <w:proofErr w:type="spellStart"/>
+      <w:r>
+        <w:rPr>
+          <w:rFonts w:ascii="Arial" w:eastAsia="Times New Roman" w:hAnsi="Arial" w:cs="Arial"/>
+          <w:color w:val="1F1F1F"/>
+          <w:kern w:val="0"/>
+          <w:sz w:val="24"/>
+          <w:szCs w:val="24"/>
+          <w:lang w:eastAsia="pt-BR"/>
+          <w14:ligatures w14:val="none"/>
+        </w:rPr>
+        <w:t>v.data_venda</w:t>
+      </w:r>
+      <w:proofErr w:type="spellEnd"/>
+      <w:r>
+        <w:rPr>
+          <w:rFonts w:ascii="Arial" w:eastAsia="Times New Roman" w:hAnsi="Arial" w:cs="Arial"/>
+          <w:color w:val="1F1F1F"/>
+          <w:kern w:val="0"/>
+          <w:sz w:val="24"/>
+          <w:szCs w:val="24"/>
+          <w:lang w:eastAsia="pt-BR"/>
+          <w14:ligatures w14:val="none"/>
+        </w:rPr>
+        <w:t xml:space="preserve">) AS </w:t>
+      </w:r>
+      <w:proofErr w:type="spellStart"/>
+      <w:r>
+        <w:rPr>
+          <w:rFonts w:ascii="Arial" w:eastAsia="Times New Roman" w:hAnsi="Arial" w:cs="Arial"/>
+          <w:color w:val="1F1F1F"/>
+          <w:kern w:val="0"/>
+          <w:sz w:val="24"/>
+          <w:szCs w:val="24"/>
+          <w:lang w:eastAsia="pt-BR"/>
+          <w14:ligatures w14:val="none"/>
+        </w:rPr>
+        <w:t>mes</w:t>
+      </w:r>
+      <w:proofErr w:type="spellEnd"/>
+      <w:r>
+        <w:rPr>
+          <w:rFonts w:ascii="Arial" w:eastAsia="Times New Roman" w:hAnsi="Arial" w:cs="Arial"/>
+          <w:color w:val="1F1F1F"/>
+          <w:kern w:val="0"/>
+          <w:sz w:val="24"/>
+          <w:szCs w:val="24"/>
+          <w:lang w:eastAsia="pt-BR"/>
+          <w14:ligatures w14:val="none"/>
+        </w:rPr>
+        <w:t>, SUM(</w:t>
+      </w:r>
+      <w:proofErr w:type="spellStart"/>
+      <w:proofErr w:type="gramStart"/>
+      <w:r>
+        <w:rPr>
+          <w:rFonts w:ascii="Arial" w:eastAsia="Times New Roman" w:hAnsi="Arial" w:cs="Arial"/>
+          <w:color w:val="1F1F1F"/>
+          <w:kern w:val="0"/>
+          <w:sz w:val="24"/>
+          <w:szCs w:val="24"/>
+          <w:lang w:eastAsia="pt-BR"/>
+          <w14:ligatures w14:val="none"/>
+        </w:rPr>
+        <w:t>v.valor</w:t>
+      </w:r>
+      <w:proofErr w:type="gramEnd"/>
+      <w:r>
+        <w:rPr>
+          <w:rFonts w:ascii="Arial" w:eastAsia="Times New Roman" w:hAnsi="Arial" w:cs="Arial"/>
+          <w:color w:val="1F1F1F"/>
+          <w:kern w:val="0"/>
+          <w:sz w:val="24"/>
+          <w:szCs w:val="24"/>
+          <w:lang w:eastAsia="pt-BR"/>
+          <w14:ligatures w14:val="none"/>
+        </w:rPr>
+        <w:t>_venda</w:t>
+      </w:r>
+      <w:proofErr w:type="spellEnd"/>
+      <w:r>
+        <w:rPr>
+          <w:rFonts w:ascii="Arial" w:eastAsia="Times New Roman" w:hAnsi="Arial" w:cs="Arial"/>
+          <w:color w:val="1F1F1F"/>
+          <w:kern w:val="0"/>
+          <w:sz w:val="24"/>
+          <w:szCs w:val="24"/>
+          <w:lang w:eastAsia="pt-BR"/>
+          <w14:ligatures w14:val="none"/>
+        </w:rPr>
+        <w:t xml:space="preserve">) AS </w:t>
+      </w:r>
+      <w:proofErr w:type="spellStart"/>
+      <w:r>
+        <w:rPr>
+          <w:rFonts w:ascii="Arial" w:eastAsia="Times New Roman" w:hAnsi="Arial" w:cs="Arial"/>
+          <w:color w:val="1F1F1F"/>
+          <w:kern w:val="0"/>
+          <w:sz w:val="24"/>
+          <w:szCs w:val="24"/>
+          <w:lang w:eastAsia="pt-BR"/>
+          <w14:ligatures w14:val="none"/>
+        </w:rPr>
+        <w:t>total_vendas</w:t>
+      </w:r>
+      <w:proofErr w:type="spellEnd"/>
+      <w:r>
+        <w:rPr>
+          <w:rFonts w:ascii="Arial" w:eastAsia="Times New Roman" w:hAnsi="Arial" w:cs="Arial"/>
+          <w:color w:val="1F1F1F"/>
+          <w:kern w:val="0"/>
+          <w:sz w:val="24"/>
+          <w:szCs w:val="24"/>
+          <w:lang w:eastAsia="pt-BR"/>
+          <w14:ligatures w14:val="none"/>
+        </w:rPr>
+        <w:t xml:space="preserve"> FROM vendas v GROUP BY YEAR(</w:t>
+      </w:r>
+      <w:proofErr w:type="spellStart"/>
+      <w:r>
+        <w:rPr>
+          <w:rFonts w:ascii="Arial" w:eastAsia="Times New Roman" w:hAnsi="Arial" w:cs="Arial"/>
+          <w:color w:val="1F1F1F"/>
+          <w:kern w:val="0"/>
+          <w:sz w:val="24"/>
+          <w:szCs w:val="24"/>
+          <w:lang w:eastAsia="pt-BR"/>
+          <w14:ligatures w14:val="none"/>
+        </w:rPr>
+        <w:t>v.data_venda</w:t>
+      </w:r>
+      <w:proofErr w:type="spellEnd"/>
+      <w:r>
+        <w:rPr>
+          <w:rFonts w:ascii="Arial" w:eastAsia="Times New Roman" w:hAnsi="Arial" w:cs="Arial"/>
+          <w:color w:val="1F1F1F"/>
+          <w:kern w:val="0"/>
+          <w:sz w:val="24"/>
+          <w:szCs w:val="24"/>
+          <w:lang w:eastAsia="pt-BR"/>
+          <w14:ligatures w14:val="none"/>
+        </w:rPr>
+        <w:t>), MONTH(</w:t>
+      </w:r>
+      <w:proofErr w:type="spellStart"/>
+      <w:r>
+        <w:rPr>
+          <w:rFonts w:ascii="Arial" w:eastAsia="Times New Roman" w:hAnsi="Arial" w:cs="Arial"/>
+          <w:color w:val="1F1F1F"/>
+          <w:kern w:val="0"/>
+          <w:sz w:val="24"/>
+          <w:szCs w:val="24"/>
+          <w:lang w:eastAsia="pt-BR"/>
+          <w14:ligatures w14:val="none"/>
+        </w:rPr>
+        <w:t>v.data_venda</w:t>
+      </w:r>
+      <w:proofErr w:type="spellEnd"/>
+      <w:r>
+        <w:rPr>
+          <w:rFonts w:ascii="Arial" w:eastAsia="Times New Roman" w:hAnsi="Arial" w:cs="Arial"/>
+          <w:color w:val="1F1F1F"/>
+          <w:kern w:val="0"/>
+          <w:sz w:val="24"/>
+          <w:szCs w:val="24"/>
+          <w:lang w:eastAsia="pt-BR"/>
+          <w14:ligatures w14:val="none"/>
+        </w:rPr>
+        <w:t xml:space="preserve">) ORDER BY </w:t>
+      </w:r>
+      <w:proofErr w:type="spellStart"/>
+      <w:r>
+        <w:rPr>
+          <w:rFonts w:ascii="Arial" w:eastAsia="Times New Roman" w:hAnsi="Arial" w:cs="Arial"/>
+          <w:color w:val="1F1F1F"/>
+          <w:kern w:val="0"/>
+          <w:sz w:val="24"/>
+          <w:szCs w:val="24"/>
+          <w:lang w:eastAsia="pt-BR"/>
+          <w14:ligatures w14:val="none"/>
+        </w:rPr>
+        <w:t>total_vendas</w:t>
+      </w:r>
+      <w:proofErr w:type="spellEnd"/>
+      <w:r>
+        <w:rPr>
+          <w:rFonts w:ascii="Arial" w:eastAsia="Times New Roman" w:hAnsi="Arial" w:cs="Arial"/>
+          <w:color w:val="1F1F1F"/>
+          <w:kern w:val="0"/>
+          <w:sz w:val="24"/>
+          <w:szCs w:val="24"/>
+          <w:lang w:eastAsia="pt-BR"/>
+          <w14:ligatures w14:val="none"/>
+        </w:rPr>
+        <w:t xml:space="preserve"> DESC;</w:t>
+      </w:r>
+    </w:p>
+    <w:p>
+      <w:pPr>
+        <w:pStyle w:val="PargrafodaLista"/>
+        <w:spacing w:after="0" w:line="420" w:lineRule="atLeast"/>
+        <w:rPr>
+          <w:rFonts w:ascii="Arial" w:eastAsia="Times New Roman" w:hAnsi="Arial" w:cs="Arial"/>
+          <w:color w:val="1F1F1F"/>
+          <w:kern w:val="0"/>
+          <w:sz w:val="24"/>
+          <w:szCs w:val="24"/>
+          <w:lang w:eastAsia="pt-BR"/>
+          <w14:ligatures w14:val="none"/>
+        </w:rPr>
+      </w:pPr>
+    </w:p>
+    <w:p>
+      <w:pPr>
+        <w:pStyle w:val="PargrafodaLista"/>
+        <w:numPr>
+          <w:ilvl w:val="0"/>
+          <w:numId w:val="3"/>
+        </w:numPr>
+        <w:spacing w:after="0" w:line="420" w:lineRule="atLeast"/>
         <w:rPr>
           <w:rFonts w:ascii="Arial" w:eastAsia="Times New Roman" w:hAnsi="Arial" w:cs="Arial"/>
           <w:b/>
@@ -388,27 +1722,28 @@
           <w:kern w:val="0"/>
           <w:sz w:val="24"/>
           <w:szCs w:val="24"/>
-          <w:bdr w:val="none" w:sz="0" w:space="0" w:color="auto" w:frame="1"/>
-          <w:lang w:eastAsia="pt-BR"/>
-          <w14:ligatures w14:val="none"/>
-        </w:rPr>
-        <w:t>8.</w:t>
-      </w:r>
-      <w:r>
-        <w:rPr>
-          <w:rFonts w:ascii="Arial" w:eastAsia="Times New Roman" w:hAnsi="Arial" w:cs="Arial"/>
-          <w:color w:val="1F1F1F"/>
-          <w:kern w:val="0"/>
-          <w:sz w:val="24"/>
-          <w:szCs w:val="24"/>
-          <w:lang w:eastAsia="pt-BR"/>
-          <w14:ligatures w14:val="none"/>
-        </w:rPr>
-        <w:t xml:space="preserve"> Calcule o total de vendas por mês e ano e identifique o mês com o maior volume de vendas.</w:t>
+          <w:lang w:eastAsia="pt-BR"/>
+          <w14:ligatures w14:val="none"/>
+        </w:rPr>
+      </w:pPr>
+      <w:r>
+        <w:rPr>
+          <w:rFonts w:ascii="Arial" w:eastAsia="Times New Roman" w:hAnsi="Arial" w:cs="Arial"/>
+          <w:b/>
+          <w:bCs/>
+          <w:color w:val="1F1F1F"/>
+          <w:kern w:val="0"/>
+          <w:sz w:val="24"/>
+          <w:szCs w:val="24"/>
+          <w:lang w:eastAsia="pt-BR"/>
+          <w14:ligatures w14:val="none"/>
+        </w:rPr>
+        <w:t>Encontre os funcionários que não possuem dependentes e ganham mais que a média salarial da empresa.</w:t>
       </w:r>
     </w:p>
     <w:p>
       <w:pPr>
+        <w:pStyle w:val="PargrafodaLista"/>
         <w:spacing w:after="0" w:line="420" w:lineRule="atLeast"/>
         <w:rPr>
           <w:rFonts w:ascii="Arial" w:eastAsia="Times New Roman" w:hAnsi="Arial" w:cs="Arial"/>
@@ -421,6 +1756,199 @@
         </w:rPr>
       </w:pPr>
       <w:r>
+        <w:rPr>
+          <w:rFonts w:ascii="Arial" w:eastAsia="Times New Roman" w:hAnsi="Arial" w:cs="Arial"/>
+          <w:color w:val="1F1F1F"/>
+          <w:kern w:val="0"/>
+          <w:sz w:val="24"/>
+          <w:szCs w:val="24"/>
+          <w:lang w:eastAsia="pt-BR"/>
+          <w14:ligatures w14:val="none"/>
+        </w:rPr>
+        <w:t xml:space="preserve">SELECT </w:t>
+      </w:r>
+      <w:proofErr w:type="spellStart"/>
+      <w:proofErr w:type="gramStart"/>
+      <w:r>
+        <w:rPr>
+          <w:rFonts w:ascii="Arial" w:eastAsia="Times New Roman" w:hAnsi="Arial" w:cs="Arial"/>
+          <w:color w:val="1F1F1F"/>
+          <w:kern w:val="0"/>
+          <w:sz w:val="24"/>
+          <w:szCs w:val="24"/>
+          <w:lang w:eastAsia="pt-BR"/>
+          <w14:ligatures w14:val="none"/>
+        </w:rPr>
+        <w:t>f.nome</w:t>
+      </w:r>
+      <w:proofErr w:type="spellEnd"/>
+      <w:proofErr w:type="gramEnd"/>
+      <w:r>
+        <w:rPr>
+          <w:rFonts w:ascii="Arial" w:eastAsia="Times New Roman" w:hAnsi="Arial" w:cs="Arial"/>
+          <w:color w:val="1F1F1F"/>
+          <w:kern w:val="0"/>
+          <w:sz w:val="24"/>
+          <w:szCs w:val="24"/>
+          <w:lang w:eastAsia="pt-BR"/>
+          <w14:ligatures w14:val="none"/>
+        </w:rPr>
+        <w:t xml:space="preserve"> FROM </w:t>
+      </w:r>
+      <w:proofErr w:type="spellStart"/>
+      <w:r>
+        <w:rPr>
+          <w:rFonts w:ascii="Arial" w:eastAsia="Times New Roman" w:hAnsi="Arial" w:cs="Arial"/>
+          <w:color w:val="1F1F1F"/>
+          <w:kern w:val="0"/>
+          <w:sz w:val="24"/>
+          <w:szCs w:val="24"/>
+          <w:lang w:eastAsia="pt-BR"/>
+          <w14:ligatures w14:val="none"/>
+        </w:rPr>
+        <w:t>funcionarios</w:t>
+      </w:r>
+      <w:proofErr w:type="spellEnd"/>
+      <w:r>
+        <w:rPr>
+          <w:rFonts w:ascii="Arial" w:eastAsia="Times New Roman" w:hAnsi="Arial" w:cs="Arial"/>
+          <w:color w:val="1F1F1F"/>
+          <w:kern w:val="0"/>
+          <w:sz w:val="24"/>
+          <w:szCs w:val="24"/>
+          <w:lang w:eastAsia="pt-BR"/>
+          <w14:ligatures w14:val="none"/>
+        </w:rPr>
+        <w:t xml:space="preserve"> f WHERE </w:t>
+      </w:r>
+      <w:proofErr w:type="spellStart"/>
+      <w:r>
+        <w:rPr>
+          <w:rFonts w:ascii="Arial" w:eastAsia="Times New Roman" w:hAnsi="Arial" w:cs="Arial"/>
+          <w:color w:val="1F1F1F"/>
+          <w:kern w:val="0"/>
+          <w:sz w:val="24"/>
+          <w:szCs w:val="24"/>
+          <w:lang w:eastAsia="pt-BR"/>
+          <w14:ligatures w14:val="none"/>
+        </w:rPr>
+        <w:t>f.dependentes</w:t>
+      </w:r>
+      <w:proofErr w:type="spellEnd"/>
+      <w:r>
+        <w:rPr>
+          <w:rFonts w:ascii="Arial" w:eastAsia="Times New Roman" w:hAnsi="Arial" w:cs="Arial"/>
+          <w:color w:val="1F1F1F"/>
+          <w:kern w:val="0"/>
+          <w:sz w:val="24"/>
+          <w:szCs w:val="24"/>
+          <w:lang w:eastAsia="pt-BR"/>
+          <w14:ligatures w14:val="none"/>
+        </w:rPr>
+        <w:t xml:space="preserve"> = 0 AND </w:t>
+      </w:r>
+      <w:proofErr w:type="spellStart"/>
+      <w:r>
+        <w:rPr>
+          <w:rFonts w:ascii="Arial" w:eastAsia="Times New Roman" w:hAnsi="Arial" w:cs="Arial"/>
+          <w:color w:val="1F1F1F"/>
+          <w:kern w:val="0"/>
+          <w:sz w:val="24"/>
+          <w:szCs w:val="24"/>
+          <w:lang w:eastAsia="pt-BR"/>
+          <w14:ligatures w14:val="none"/>
+        </w:rPr>
+        <w:t>f.salario</w:t>
+      </w:r>
+      <w:proofErr w:type="spellEnd"/>
+      <w:r>
+        <w:rPr>
+          <w:rFonts w:ascii="Arial" w:eastAsia="Times New Roman" w:hAnsi="Arial" w:cs="Arial"/>
+          <w:color w:val="1F1F1F"/>
+          <w:kern w:val="0"/>
+          <w:sz w:val="24"/>
+          <w:szCs w:val="24"/>
+          <w:lang w:eastAsia="pt-BR"/>
+          <w14:ligatures w14:val="none"/>
+        </w:rPr>
+        <w:t xml:space="preserve"> &gt; (SELECT AVG(</w:t>
+      </w:r>
+      <w:proofErr w:type="spellStart"/>
+      <w:r>
+        <w:rPr>
+          <w:rFonts w:ascii="Arial" w:eastAsia="Times New Roman" w:hAnsi="Arial" w:cs="Arial"/>
+          <w:color w:val="1F1F1F"/>
+          <w:kern w:val="0"/>
+          <w:sz w:val="24"/>
+          <w:szCs w:val="24"/>
+          <w:lang w:eastAsia="pt-BR"/>
+          <w14:ligatures w14:val="none"/>
+        </w:rPr>
+        <w:t>s.salario</w:t>
+      </w:r>
+      <w:proofErr w:type="spellEnd"/>
+      <w:r>
+        <w:rPr>
+          <w:rFonts w:ascii="Arial" w:eastAsia="Times New Roman" w:hAnsi="Arial" w:cs="Arial"/>
+          <w:color w:val="1F1F1F"/>
+          <w:kern w:val="0"/>
+          <w:sz w:val="24"/>
+          <w:szCs w:val="24"/>
+          <w:lang w:eastAsia="pt-BR"/>
+          <w14:ligatures w14:val="none"/>
+        </w:rPr>
+        <w:t xml:space="preserve">) FROM </w:t>
+      </w:r>
+      <w:proofErr w:type="spellStart"/>
+      <w:r>
+        <w:rPr>
+          <w:rFonts w:ascii="Arial" w:eastAsia="Times New Roman" w:hAnsi="Arial" w:cs="Arial"/>
+          <w:color w:val="1F1F1F"/>
+          <w:kern w:val="0"/>
+          <w:sz w:val="24"/>
+          <w:szCs w:val="24"/>
+          <w:lang w:eastAsia="pt-BR"/>
+          <w14:ligatures w14:val="none"/>
+        </w:rPr>
+        <w:t>funcionarios</w:t>
+      </w:r>
+      <w:proofErr w:type="spellEnd"/>
+      <w:r>
+        <w:rPr>
+          <w:rFonts w:ascii="Arial" w:eastAsia="Times New Roman" w:hAnsi="Arial" w:cs="Arial"/>
+          <w:color w:val="1F1F1F"/>
+          <w:kern w:val="0"/>
+          <w:sz w:val="24"/>
+          <w:szCs w:val="24"/>
+          <w:lang w:eastAsia="pt-BR"/>
+          <w14:ligatures w14:val="none"/>
+        </w:rPr>
+        <w:t xml:space="preserve"> s);</w:t>
+      </w:r>
+    </w:p>
+    <w:p>
+      <w:pPr>
+        <w:pStyle w:val="PargrafodaLista"/>
+        <w:spacing w:after="0" w:line="420" w:lineRule="atLeast"/>
+        <w:rPr>
+          <w:rFonts w:ascii="Arial" w:eastAsia="Times New Roman" w:hAnsi="Arial" w:cs="Arial"/>
+          <w:color w:val="1F1F1F"/>
+          <w:kern w:val="0"/>
+          <w:sz w:val="24"/>
+          <w:szCs w:val="24"/>
+          <w:lang w:eastAsia="pt-BR"/>
+          <w14:ligatures w14:val="none"/>
+        </w:rPr>
+      </w:pPr>
+    </w:p>
+    <w:p>
+      <w:pPr>
+        <w:pStyle w:val="PargrafodaLista"/>
+        <w:numPr>
+          <w:ilvl w:val="0"/>
+          <w:numId w:val="3"/>
+        </w:numPr>
+        <w:spacing w:after="0" w:line="420" w:lineRule="atLeast"/>
         <w:rPr>
           <w:rFonts w:ascii="Arial" w:eastAsia="Times New Roman" w:hAnsi="Arial" w:cs="Arial"/>
           <w:b/>
@@ -429,27 +1957,28 @@
           <w:kern w:val="0"/>
           <w:sz w:val="24"/>
           <w:szCs w:val="24"/>
-          <w:bdr w:val="none" w:sz="0" w:space="0" w:color="auto" w:frame="1"/>
-          <w:lang w:eastAsia="pt-BR"/>
-          <w14:ligatures w14:val="none"/>
-        </w:rPr>
-        <w:t>9.</w:t>
-      </w:r>
-      <w:r>
-        <w:rPr>
-          <w:rFonts w:ascii="Arial" w:eastAsia="Times New Roman" w:hAnsi="Arial" w:cs="Arial"/>
-          <w:color w:val="1F1F1F"/>
-          <w:kern w:val="0"/>
-          <w:sz w:val="24"/>
-          <w:szCs w:val="24"/>
-          <w:lang w:eastAsia="pt-BR"/>
-          <w14:ligatures w14:val="none"/>
-        </w:rPr>
-        <w:t xml:space="preserve"> Encontre os funcionários que não possuem dependentes e ganham mais que a média salarial da empresa.</w:t>
+          <w:lang w:eastAsia="pt-BR"/>
+          <w14:ligatures w14:val="none"/>
+        </w:rPr>
+      </w:pPr>
+      <w:r>
+        <w:rPr>
+          <w:rFonts w:ascii="Arial" w:eastAsia="Times New Roman" w:hAnsi="Arial" w:cs="Arial"/>
+          <w:b/>
+          <w:bCs/>
+          <w:color w:val="1F1F1F"/>
+          <w:kern w:val="0"/>
+          <w:sz w:val="24"/>
+          <w:szCs w:val="24"/>
+          <w:lang w:eastAsia="pt-BR"/>
+          <w14:ligatures w14:val="none"/>
+        </w:rPr>
+        <w:t>Liste os departamentos com a menor taxa de turnover (rotatividade de funcionários).</w:t>
       </w:r>
     </w:p>
     <w:p>
       <w:pPr>
+        <w:pStyle w:val="PargrafodaLista"/>
         <w:spacing w:after="0" w:line="420" w:lineRule="atLeast"/>
         <w:rPr>
           <w:rFonts w:ascii="Arial" w:eastAsia="Times New Roman" w:hAnsi="Arial" w:cs="Arial"/>
@@ -462,6 +1991,255 @@
         </w:rPr>
       </w:pPr>
       <w:r>
+        <w:rPr>
+          <w:rFonts w:ascii="Arial" w:eastAsia="Times New Roman" w:hAnsi="Arial" w:cs="Arial"/>
+          <w:color w:val="1F1F1F"/>
+          <w:kern w:val="0"/>
+          <w:sz w:val="24"/>
+          <w:szCs w:val="24"/>
+          <w:lang w:eastAsia="pt-BR"/>
+          <w14:ligatures w14:val="none"/>
+        </w:rPr>
+        <w:t xml:space="preserve">SELECT </w:t>
+      </w:r>
+      <w:proofErr w:type="spellStart"/>
+      <w:proofErr w:type="gramStart"/>
+      <w:r>
+        <w:rPr>
+          <w:rFonts w:ascii="Arial" w:eastAsia="Times New Roman" w:hAnsi="Arial" w:cs="Arial"/>
+          <w:color w:val="1F1F1F"/>
+          <w:kern w:val="0"/>
+          <w:sz w:val="24"/>
+          <w:szCs w:val="24"/>
+          <w:lang w:eastAsia="pt-BR"/>
+          <w14:ligatures w14:val="none"/>
+        </w:rPr>
+        <w:t>d.nome</w:t>
+      </w:r>
+      <w:proofErr w:type="spellEnd"/>
+      <w:proofErr w:type="gramEnd"/>
+      <w:r>
+        <w:rPr>
+          <w:rFonts w:ascii="Arial" w:eastAsia="Times New Roman" w:hAnsi="Arial" w:cs="Arial"/>
+          <w:color w:val="1F1F1F"/>
+          <w:kern w:val="0"/>
+          <w:sz w:val="24"/>
+          <w:szCs w:val="24"/>
+          <w:lang w:eastAsia="pt-BR"/>
+          <w14:ligatures w14:val="none"/>
+        </w:rPr>
+        <w:t xml:space="preserve">, COUNT(f.id) AS </w:t>
+      </w:r>
+      <w:proofErr w:type="spellStart"/>
+      <w:r>
+        <w:rPr>
+          <w:rFonts w:ascii="Arial" w:eastAsia="Times New Roman" w:hAnsi="Arial" w:cs="Arial"/>
+          <w:color w:val="1F1F1F"/>
+          <w:kern w:val="0"/>
+          <w:sz w:val="24"/>
+          <w:szCs w:val="24"/>
+          <w:lang w:eastAsia="pt-BR"/>
+          <w14:ligatures w14:val="none"/>
+        </w:rPr>
+        <w:t>funcionarios_ativos</w:t>
+      </w:r>
+      <w:proofErr w:type="spellEnd"/>
+      <w:r>
+        <w:rPr>
+          <w:rFonts w:ascii="Arial" w:eastAsia="Times New Roman" w:hAnsi="Arial" w:cs="Arial"/>
+          <w:color w:val="1F1F1F"/>
+          <w:kern w:val="0"/>
+          <w:sz w:val="24"/>
+          <w:szCs w:val="24"/>
+          <w:lang w:eastAsia="pt-BR"/>
+          <w14:ligatures w14:val="none"/>
+        </w:rPr>
+        <w:t xml:space="preserve"> FROM departamentos d INNER JOIN </w:t>
+      </w:r>
+      <w:proofErr w:type="spellStart"/>
+      <w:r>
+        <w:rPr>
+          <w:rFonts w:ascii="Arial" w:eastAsia="Times New Roman" w:hAnsi="Arial" w:cs="Arial"/>
+          <w:color w:val="1F1F1F"/>
+          <w:kern w:val="0"/>
+          <w:sz w:val="24"/>
+          <w:szCs w:val="24"/>
+          <w:lang w:eastAsia="pt-BR"/>
+          <w14:ligatures w14:val="none"/>
+        </w:rPr>
+        <w:t>funcionarios</w:t>
+      </w:r>
+      <w:proofErr w:type="spellEnd"/>
+      <w:r>
+        <w:rPr>
+          <w:rFonts w:ascii="Arial" w:eastAsia="Times New Roman" w:hAnsi="Arial" w:cs="Arial"/>
+          <w:color w:val="1F1F1F"/>
+          <w:kern w:val="0"/>
+          <w:sz w:val="24"/>
+          <w:szCs w:val="24"/>
+          <w:lang w:eastAsia="pt-BR"/>
+          <w14:ligatures w14:val="none"/>
+        </w:rPr>
+        <w:t xml:space="preserve"> f ON d.id = </w:t>
+      </w:r>
+      <w:proofErr w:type="spellStart"/>
+      <w:r>
+        <w:rPr>
+          <w:rFonts w:ascii="Arial" w:eastAsia="Times New Roman" w:hAnsi="Arial" w:cs="Arial"/>
+          <w:color w:val="1F1F1F"/>
+          <w:kern w:val="0"/>
+          <w:sz w:val="24"/>
+          <w:szCs w:val="24"/>
+          <w:lang w:eastAsia="pt-BR"/>
+          <w14:ligatures w14:val="none"/>
+        </w:rPr>
+        <w:t>f.departamento_id</w:t>
+      </w:r>
+      <w:proofErr w:type="spellEnd"/>
+      <w:r>
+        <w:rPr>
+          <w:rFonts w:ascii="Arial" w:eastAsia="Times New Roman" w:hAnsi="Arial" w:cs="Arial"/>
+          <w:color w:val="1F1F1F"/>
+          <w:kern w:val="0"/>
+          <w:sz w:val="24"/>
+          <w:szCs w:val="24"/>
+          <w:lang w:eastAsia="pt-BR"/>
+          <w14:ligatures w14:val="none"/>
+        </w:rPr>
+        <w:t xml:space="preserve"> WHERE </w:t>
+      </w:r>
+      <w:proofErr w:type="spellStart"/>
+      <w:r>
+        <w:rPr>
+          <w:rFonts w:ascii="Arial" w:eastAsia="Times New Roman" w:hAnsi="Arial" w:cs="Arial"/>
+          <w:color w:val="1F1F1F"/>
+          <w:kern w:val="0"/>
+          <w:sz w:val="24"/>
+          <w:szCs w:val="24"/>
+          <w:lang w:eastAsia="pt-BR"/>
+          <w14:ligatures w14:val="none"/>
+        </w:rPr>
+        <w:t>f.status</w:t>
+      </w:r>
+      <w:proofErr w:type="spellEnd"/>
+      <w:r>
+        <w:rPr>
+          <w:rFonts w:ascii="Arial" w:eastAsia="Times New Roman" w:hAnsi="Arial" w:cs="Arial"/>
+          <w:color w:val="1F1F1F"/>
+          <w:kern w:val="0"/>
+          <w:sz w:val="24"/>
+          <w:szCs w:val="24"/>
+          <w:lang w:eastAsia="pt-BR"/>
+          <w14:ligatures w14:val="none"/>
+        </w:rPr>
+        <w:t xml:space="preserve"> = 'ativo' GROUP BY </w:t>
+      </w:r>
+      <w:proofErr w:type="spellStart"/>
+      <w:r>
+        <w:rPr>
+          <w:rFonts w:ascii="Arial" w:eastAsia="Times New Roman" w:hAnsi="Arial" w:cs="Arial"/>
+          <w:color w:val="1F1F1F"/>
+          <w:kern w:val="0"/>
+          <w:sz w:val="24"/>
+          <w:szCs w:val="24"/>
+          <w:lang w:eastAsia="pt-BR"/>
+          <w14:ligatures w14:val="none"/>
+        </w:rPr>
+        <w:t>d.nome</w:t>
+      </w:r>
+      <w:proofErr w:type="spellEnd"/>
+      <w:r>
+        <w:rPr>
+          <w:rFonts w:ascii="Arial" w:eastAsia="Times New Roman" w:hAnsi="Arial" w:cs="Arial"/>
+          <w:color w:val="1F1F1F"/>
+          <w:kern w:val="0"/>
+          <w:sz w:val="24"/>
+          <w:szCs w:val="24"/>
+          <w:lang w:eastAsia="pt-BR"/>
+          <w14:ligatures w14:val="none"/>
+        </w:rPr>
+        <w:t xml:space="preserve"> ORDER BY </w:t>
+      </w:r>
+      <w:proofErr w:type="spellStart"/>
+      <w:r>
+        <w:rPr>
+          <w:rFonts w:ascii="Arial" w:eastAsia="Times New Roman" w:hAnsi="Arial" w:cs="Arial"/>
+          <w:color w:val="1F1F1F"/>
+          <w:kern w:val="0"/>
+          <w:sz w:val="24"/>
+          <w:szCs w:val="24"/>
+          <w:lang w:eastAsia="pt-BR"/>
+          <w14:ligatures w14:val="none"/>
+        </w:rPr>
+        <w:t>funcionarios_ativos</w:t>
+      </w:r>
+      <w:proofErr w:type="spellEnd"/>
+      <w:r>
+        <w:rPr>
+          <w:rFonts w:ascii="Arial" w:eastAsia="Times New Roman" w:hAnsi="Arial" w:cs="Arial"/>
+          <w:color w:val="1F1F1F"/>
+          <w:kern w:val="0"/>
+          <w:sz w:val="24"/>
+          <w:szCs w:val="24"/>
+          <w:lang w:eastAsia="pt-BR"/>
+          <w14:ligatures w14:val="none"/>
+        </w:rPr>
+        <w:t xml:space="preserve"> ASC;</w:t>
+      </w:r>
+    </w:p>
+    <w:p>
+      <w:pPr>
+        <w:pStyle w:val="PargrafodaLista"/>
+        <w:spacing w:after="0" w:line="420" w:lineRule="atLeast"/>
+        <w:rPr>
+          <w:rFonts w:ascii="Arial" w:eastAsia="Times New Roman" w:hAnsi="Arial" w:cs="Arial"/>
+          <w:color w:val="1F1F1F"/>
+          <w:kern w:val="0"/>
+          <w:sz w:val="24"/>
+          <w:szCs w:val="24"/>
+          <w:lang w:eastAsia="pt-BR"/>
+          <w14:ligatures w14:val="none"/>
+        </w:rPr>
+      </w:pPr>
+    </w:p>
+    <w:p>
+      <w:pPr>
+        <w:pStyle w:val="PargrafodaLista"/>
+        <w:spacing w:after="0" w:line="420" w:lineRule="atLeast"/>
+        <w:rPr>
+          <w:rFonts w:ascii="Arial" w:eastAsia="Times New Roman" w:hAnsi="Arial" w:cs="Arial"/>
+          <w:color w:val="1F1F1F"/>
+          <w:kern w:val="0"/>
+          <w:sz w:val="24"/>
+          <w:szCs w:val="24"/>
+          <w:lang w:eastAsia="pt-BR"/>
+          <w14:ligatures w14:val="none"/>
+        </w:rPr>
+      </w:pPr>
+    </w:p>
+    <w:p>
+      <w:pPr>
+        <w:pStyle w:val="PargrafodaLista"/>
+        <w:spacing w:after="0" w:line="420" w:lineRule="atLeast"/>
+        <w:rPr>
+          <w:rFonts w:ascii="Arial" w:eastAsia="Times New Roman" w:hAnsi="Arial" w:cs="Arial"/>
+          <w:color w:val="1F1F1F"/>
+          <w:kern w:val="0"/>
+          <w:sz w:val="24"/>
+          <w:szCs w:val="24"/>
+          <w:lang w:eastAsia="pt-BR"/>
+          <w14:ligatures w14:val="none"/>
+        </w:rPr>
+      </w:pPr>
+    </w:p>
+    <w:p>
+      <w:pPr>
+        <w:pStyle w:val="PargrafodaLista"/>
+        <w:numPr>
+          <w:ilvl w:val="0"/>
+          <w:numId w:val="3"/>
+        </w:numPr>
+        <w:spacing w:after="0" w:line="420" w:lineRule="atLeast"/>
         <w:rPr>
           <w:rFonts w:ascii="Arial" w:eastAsia="Times New Roman" w:hAnsi="Arial" w:cs="Arial"/>
           <w:b/>
@@ -470,27 +2248,29 @@
           <w:kern w:val="0"/>
           <w:sz w:val="24"/>
           <w:szCs w:val="24"/>
-          <w:bdr w:val="none" w:sz="0" w:space="0" w:color="auto" w:frame="1"/>
-          <w:lang w:eastAsia="pt-BR"/>
-          <w14:ligatures w14:val="none"/>
-        </w:rPr>
-        <w:t>10.</w:t>
-      </w:r>
-      <w:r>
-        <w:rPr>
-          <w:rFonts w:ascii="Arial" w:eastAsia="Times New Roman" w:hAnsi="Arial" w:cs="Arial"/>
-          <w:color w:val="1F1F1F"/>
-          <w:kern w:val="0"/>
-          <w:sz w:val="24"/>
-          <w:szCs w:val="24"/>
-          <w:lang w:eastAsia="pt-BR"/>
-          <w14:ligatures w14:val="none"/>
-        </w:rPr>
-        <w:t xml:space="preserve"> Liste os departamentos com a menor taxa de turnover (rotatividade de funcionários).</w:t>
+          <w:lang w:eastAsia="pt-BR"/>
+          <w14:ligatures w14:val="none"/>
+        </w:rPr>
+      </w:pPr>
+      <w:r>
+        <w:rPr>
+          <w:rFonts w:ascii="Arial" w:eastAsia="Times New Roman" w:hAnsi="Arial" w:cs="Arial"/>
+          <w:b/>
+          <w:bCs/>
+          <w:color w:val="1F1F1F"/>
+          <w:kern w:val="0"/>
+          <w:sz w:val="24"/>
+          <w:szCs w:val="24"/>
+          <w:lang w:eastAsia="pt-BR"/>
+          <w14:ligatures w14:val="none"/>
+        </w:rPr>
+        <w:lastRenderedPageBreak/>
+        <w:t>Calcule o aumento salarial percentual que cada funcionário recebeu desde sua data de admissão.</w:t>
       </w:r>
     </w:p>
     <w:p>
       <w:pPr>
+        <w:pStyle w:val="PargrafodaLista"/>
         <w:spacing w:after="0" w:line="420" w:lineRule="atLeast"/>
         <w:rPr>
           <w:rFonts w:ascii="Arial" w:eastAsia="Times New Roman" w:hAnsi="Arial" w:cs="Arial"/>
@@ -503,6 +2283,199 @@
         </w:rPr>
       </w:pPr>
       <w:r>
+        <w:rPr>
+          <w:rFonts w:ascii="Arial" w:eastAsia="Times New Roman" w:hAnsi="Arial" w:cs="Arial"/>
+          <w:color w:val="1F1F1F"/>
+          <w:kern w:val="0"/>
+          <w:sz w:val="24"/>
+          <w:szCs w:val="24"/>
+          <w:lang w:eastAsia="pt-BR"/>
+          <w14:ligatures w14:val="none"/>
+        </w:rPr>
+        <w:t xml:space="preserve">SELECT </w:t>
+      </w:r>
+      <w:proofErr w:type="spellStart"/>
+      <w:proofErr w:type="gramStart"/>
+      <w:r>
+        <w:rPr>
+          <w:rFonts w:ascii="Arial" w:eastAsia="Times New Roman" w:hAnsi="Arial" w:cs="Arial"/>
+          <w:color w:val="1F1F1F"/>
+          <w:kern w:val="0"/>
+          <w:sz w:val="24"/>
+          <w:szCs w:val="24"/>
+          <w:lang w:eastAsia="pt-BR"/>
+          <w14:ligatures w14:val="none"/>
+        </w:rPr>
+        <w:t>f.nome</w:t>
+      </w:r>
+      <w:proofErr w:type="spellEnd"/>
+      <w:proofErr w:type="gramEnd"/>
+      <w:r>
+        <w:rPr>
+          <w:rFonts w:ascii="Arial" w:eastAsia="Times New Roman" w:hAnsi="Arial" w:cs="Arial"/>
+          <w:color w:val="1F1F1F"/>
+          <w:kern w:val="0"/>
+          <w:sz w:val="24"/>
+          <w:szCs w:val="24"/>
+          <w:lang w:eastAsia="pt-BR"/>
+          <w14:ligatures w14:val="none"/>
+        </w:rPr>
+        <w:t>, ((</w:t>
+      </w:r>
+      <w:proofErr w:type="spellStart"/>
+      <w:r>
+        <w:rPr>
+          <w:rFonts w:ascii="Arial" w:eastAsia="Times New Roman" w:hAnsi="Arial" w:cs="Arial"/>
+          <w:color w:val="1F1F1F"/>
+          <w:kern w:val="0"/>
+          <w:sz w:val="24"/>
+          <w:szCs w:val="24"/>
+          <w:lang w:eastAsia="pt-BR"/>
+          <w14:ligatures w14:val="none"/>
+        </w:rPr>
+        <w:t>f.salario</w:t>
+      </w:r>
+      <w:proofErr w:type="spellEnd"/>
+      <w:r>
+        <w:rPr>
+          <w:rFonts w:ascii="Arial" w:eastAsia="Times New Roman" w:hAnsi="Arial" w:cs="Arial"/>
+          <w:color w:val="1F1F1F"/>
+          <w:kern w:val="0"/>
+          <w:sz w:val="24"/>
+          <w:szCs w:val="24"/>
+          <w:lang w:eastAsia="pt-BR"/>
+          <w14:ligatures w14:val="none"/>
+        </w:rPr>
+        <w:t xml:space="preserve"> - </w:t>
+      </w:r>
+      <w:proofErr w:type="spellStart"/>
+      <w:r>
+        <w:rPr>
+          <w:rFonts w:ascii="Arial" w:eastAsia="Times New Roman" w:hAnsi="Arial" w:cs="Arial"/>
+          <w:color w:val="1F1F1F"/>
+          <w:kern w:val="0"/>
+          <w:sz w:val="24"/>
+          <w:szCs w:val="24"/>
+          <w:lang w:eastAsia="pt-BR"/>
+          <w14:ligatures w14:val="none"/>
+        </w:rPr>
+        <w:t>f.salario_inicial</w:t>
+      </w:r>
+      <w:proofErr w:type="spellEnd"/>
+      <w:r>
+        <w:rPr>
+          <w:rFonts w:ascii="Arial" w:eastAsia="Times New Roman" w:hAnsi="Arial" w:cs="Arial"/>
+          <w:color w:val="1F1F1F"/>
+          <w:kern w:val="0"/>
+          <w:sz w:val="24"/>
+          <w:szCs w:val="24"/>
+          <w:lang w:eastAsia="pt-BR"/>
+          <w14:ligatures w14:val="none"/>
+        </w:rPr>
+        <w:t xml:space="preserve">) / </w:t>
+      </w:r>
+      <w:proofErr w:type="spellStart"/>
+      <w:r>
+        <w:rPr>
+          <w:rFonts w:ascii="Arial" w:eastAsia="Times New Roman" w:hAnsi="Arial" w:cs="Arial"/>
+          <w:color w:val="1F1F1F"/>
+          <w:kern w:val="0"/>
+          <w:sz w:val="24"/>
+          <w:szCs w:val="24"/>
+          <w:lang w:eastAsia="pt-BR"/>
+          <w14:ligatures w14:val="none"/>
+        </w:rPr>
+        <w:t>f.salario_inicial</w:t>
+      </w:r>
+      <w:proofErr w:type="spellEnd"/>
+      <w:r>
+        <w:rPr>
+          <w:rFonts w:ascii="Arial" w:eastAsia="Times New Roman" w:hAnsi="Arial" w:cs="Arial"/>
+          <w:color w:val="1F1F1F"/>
+          <w:kern w:val="0"/>
+          <w:sz w:val="24"/>
+          <w:szCs w:val="24"/>
+          <w:lang w:eastAsia="pt-BR"/>
+          <w14:ligatures w14:val="none"/>
+        </w:rPr>
+        <w:t xml:space="preserve">) * 100 AS </w:t>
+      </w:r>
+      <w:proofErr w:type="spellStart"/>
+      <w:r>
+        <w:rPr>
+          <w:rFonts w:ascii="Arial" w:eastAsia="Times New Roman" w:hAnsi="Arial" w:cs="Arial"/>
+          <w:color w:val="1F1F1F"/>
+          <w:kern w:val="0"/>
+          <w:sz w:val="24"/>
+          <w:szCs w:val="24"/>
+          <w:lang w:eastAsia="pt-BR"/>
+          <w14:ligatures w14:val="none"/>
+        </w:rPr>
+        <w:t>aumento_percentual</w:t>
+      </w:r>
+      <w:proofErr w:type="spellEnd"/>
+      <w:r>
+        <w:rPr>
+          <w:rFonts w:ascii="Arial" w:eastAsia="Times New Roman" w:hAnsi="Arial" w:cs="Arial"/>
+          <w:color w:val="1F1F1F"/>
+          <w:kern w:val="0"/>
+          <w:sz w:val="24"/>
+          <w:szCs w:val="24"/>
+          <w:lang w:eastAsia="pt-BR"/>
+          <w14:ligatures w14:val="none"/>
+        </w:rPr>
+        <w:t xml:space="preserve"> FROM </w:t>
+      </w:r>
+      <w:proofErr w:type="spellStart"/>
+      <w:r>
+        <w:rPr>
+          <w:rFonts w:ascii="Arial" w:eastAsia="Times New Roman" w:hAnsi="Arial" w:cs="Arial"/>
+          <w:color w:val="1F1F1F"/>
+          <w:kern w:val="0"/>
+          <w:sz w:val="24"/>
+          <w:szCs w:val="24"/>
+          <w:lang w:eastAsia="pt-BR"/>
+          <w14:ligatures w14:val="none"/>
+        </w:rPr>
+        <w:t>funcionarios</w:t>
+      </w:r>
+      <w:proofErr w:type="spellEnd"/>
+      <w:r>
+        <w:rPr>
+          <w:rFonts w:ascii="Arial" w:eastAsia="Times New Roman" w:hAnsi="Arial" w:cs="Arial"/>
+          <w:color w:val="1F1F1F"/>
+          <w:kern w:val="0"/>
+          <w:sz w:val="24"/>
+          <w:szCs w:val="24"/>
+          <w:lang w:eastAsia="pt-BR"/>
+          <w14:ligatures w14:val="none"/>
+        </w:rPr>
+        <w:t xml:space="preserve"> f;</w:t>
+      </w:r>
+    </w:p>
+    <w:p>
+      <w:pPr>
+        <w:pStyle w:val="PargrafodaLista"/>
+        <w:spacing w:after="0" w:line="420" w:lineRule="atLeast"/>
+        <w:rPr>
+          <w:rFonts w:ascii="Arial" w:eastAsia="Times New Roman" w:hAnsi="Arial" w:cs="Arial"/>
+          <w:color w:val="1F1F1F"/>
+          <w:kern w:val="0"/>
+          <w:sz w:val="24"/>
+          <w:szCs w:val="24"/>
+          <w:lang w:eastAsia="pt-BR"/>
+          <w14:ligatures w14:val="none"/>
+        </w:rPr>
+      </w:pPr>
+    </w:p>
+    <w:p>
+      <w:pPr>
+        <w:pStyle w:val="PargrafodaLista"/>
+        <w:numPr>
+          <w:ilvl w:val="0"/>
+          <w:numId w:val="3"/>
+        </w:numPr>
+        <w:spacing w:after="0" w:line="420" w:lineRule="atLeast"/>
         <w:rPr>
           <w:rFonts w:ascii="Arial" w:eastAsia="Times New Roman" w:hAnsi="Arial" w:cs="Arial"/>
           <w:b/>
@@ -511,27 +2484,28 @@
           <w:kern w:val="0"/>
           <w:sz w:val="24"/>
           <w:szCs w:val="24"/>
-          <w:bdr w:val="none" w:sz="0" w:space="0" w:color="auto" w:frame="1"/>
-          <w:lang w:eastAsia="pt-BR"/>
-          <w14:ligatures w14:val="none"/>
-        </w:rPr>
-        <w:t>11.</w:t>
-      </w:r>
-      <w:r>
-        <w:rPr>
-          <w:rFonts w:ascii="Arial" w:eastAsia="Times New Roman" w:hAnsi="Arial" w:cs="Arial"/>
-          <w:color w:val="1F1F1F"/>
-          <w:kern w:val="0"/>
-          <w:sz w:val="24"/>
-          <w:szCs w:val="24"/>
-          <w:lang w:eastAsia="pt-BR"/>
-          <w14:ligatures w14:val="none"/>
-        </w:rPr>
-        <w:t xml:space="preserve"> Calcule o aumento salarial percentual que cada funcionário recebeu desde sua data de admissão.</w:t>
+          <w:lang w:eastAsia="pt-BR"/>
+          <w14:ligatures w14:val="none"/>
+        </w:rPr>
+      </w:pPr>
+      <w:r>
+        <w:rPr>
+          <w:rFonts w:ascii="Arial" w:eastAsia="Times New Roman" w:hAnsi="Arial" w:cs="Arial"/>
+          <w:b/>
+          <w:bCs/>
+          <w:color w:val="1F1F1F"/>
+          <w:kern w:val="0"/>
+          <w:sz w:val="24"/>
+          <w:szCs w:val="24"/>
+          <w:lang w:eastAsia="pt-BR"/>
+          <w14:ligatures w14:val="none"/>
+        </w:rPr>
+        <w:t>Encontre os funcionários que tiveram um aumento salarial superior à média da empresa no último ano.</w:t>
       </w:r>
     </w:p>
     <w:p>
       <w:pPr>
+        <w:pStyle w:val="PargrafodaLista"/>
         <w:spacing w:after="0" w:line="420" w:lineRule="atLeast"/>
         <w:rPr>
           <w:rFonts w:ascii="Arial" w:eastAsia="Times New Roman" w:hAnsi="Arial" w:cs="Arial"/>
@@ -544,6 +2518,225 @@
         </w:rPr>
       </w:pPr>
       <w:r>
+        <w:rPr>
+          <w:rFonts w:ascii="Arial" w:eastAsia="Times New Roman" w:hAnsi="Arial" w:cs="Arial"/>
+          <w:color w:val="1F1F1F"/>
+          <w:kern w:val="0"/>
+          <w:sz w:val="24"/>
+          <w:szCs w:val="24"/>
+          <w:lang w:eastAsia="pt-BR"/>
+          <w14:ligatures w14:val="none"/>
+        </w:rPr>
+        <w:t xml:space="preserve">SELECT </w:t>
+      </w:r>
+      <w:proofErr w:type="spellStart"/>
+      <w:proofErr w:type="gramStart"/>
+      <w:r>
+        <w:rPr>
+          <w:rFonts w:ascii="Arial" w:eastAsia="Times New Roman" w:hAnsi="Arial" w:cs="Arial"/>
+          <w:color w:val="1F1F1F"/>
+          <w:kern w:val="0"/>
+          <w:sz w:val="24"/>
+          <w:szCs w:val="24"/>
+          <w:lang w:eastAsia="pt-BR"/>
+          <w14:ligatures w14:val="none"/>
+        </w:rPr>
+        <w:t>f.nome</w:t>
+      </w:r>
+      <w:proofErr w:type="spellEnd"/>
+      <w:proofErr w:type="gramEnd"/>
+      <w:r>
+        <w:rPr>
+          <w:rFonts w:ascii="Arial" w:eastAsia="Times New Roman" w:hAnsi="Arial" w:cs="Arial"/>
+          <w:color w:val="1F1F1F"/>
+          <w:kern w:val="0"/>
+          <w:sz w:val="24"/>
+          <w:szCs w:val="24"/>
+          <w:lang w:eastAsia="pt-BR"/>
+          <w14:ligatures w14:val="none"/>
+        </w:rPr>
+        <w:t xml:space="preserve"> FROM </w:t>
+      </w:r>
+      <w:proofErr w:type="spellStart"/>
+      <w:r>
+        <w:rPr>
+          <w:rFonts w:ascii="Arial" w:eastAsia="Times New Roman" w:hAnsi="Arial" w:cs="Arial"/>
+          <w:color w:val="1F1F1F"/>
+          <w:kern w:val="0"/>
+          <w:sz w:val="24"/>
+          <w:szCs w:val="24"/>
+          <w:lang w:eastAsia="pt-BR"/>
+          <w14:ligatures w14:val="none"/>
+        </w:rPr>
+        <w:t>funcionarios</w:t>
+      </w:r>
+      <w:proofErr w:type="spellEnd"/>
+      <w:r>
+        <w:rPr>
+          <w:rFonts w:ascii="Arial" w:eastAsia="Times New Roman" w:hAnsi="Arial" w:cs="Arial"/>
+          <w:color w:val="1F1F1F"/>
+          <w:kern w:val="0"/>
+          <w:sz w:val="24"/>
+          <w:szCs w:val="24"/>
+          <w:lang w:eastAsia="pt-BR"/>
+          <w14:ligatures w14:val="none"/>
+        </w:rPr>
+        <w:t xml:space="preserve"> f WHERE (</w:t>
+      </w:r>
+      <w:proofErr w:type="spellStart"/>
+      <w:r>
+        <w:rPr>
+          <w:rFonts w:ascii="Arial" w:eastAsia="Times New Roman" w:hAnsi="Arial" w:cs="Arial"/>
+          <w:color w:val="1F1F1F"/>
+          <w:kern w:val="0"/>
+          <w:sz w:val="24"/>
+          <w:szCs w:val="24"/>
+          <w:lang w:eastAsia="pt-BR"/>
+          <w14:ligatures w14:val="none"/>
+        </w:rPr>
+        <w:t>f.salario</w:t>
+      </w:r>
+      <w:proofErr w:type="spellEnd"/>
+      <w:r>
+        <w:rPr>
+          <w:rFonts w:ascii="Arial" w:eastAsia="Times New Roman" w:hAnsi="Arial" w:cs="Arial"/>
+          <w:color w:val="1F1F1F"/>
+          <w:kern w:val="0"/>
+          <w:sz w:val="24"/>
+          <w:szCs w:val="24"/>
+          <w:lang w:eastAsia="pt-BR"/>
+          <w14:ligatures w14:val="none"/>
+        </w:rPr>
+        <w:t xml:space="preserve"> - </w:t>
+      </w:r>
+      <w:proofErr w:type="spellStart"/>
+      <w:r>
+        <w:rPr>
+          <w:rFonts w:ascii="Arial" w:eastAsia="Times New Roman" w:hAnsi="Arial" w:cs="Arial"/>
+          <w:color w:val="1F1F1F"/>
+          <w:kern w:val="0"/>
+          <w:sz w:val="24"/>
+          <w:szCs w:val="24"/>
+          <w:lang w:eastAsia="pt-BR"/>
+          <w14:ligatures w14:val="none"/>
+        </w:rPr>
+        <w:t>f.salario_ano_passado</w:t>
+      </w:r>
+      <w:proofErr w:type="spellEnd"/>
+      <w:r>
+        <w:rPr>
+          <w:rFonts w:ascii="Arial" w:eastAsia="Times New Roman" w:hAnsi="Arial" w:cs="Arial"/>
+          <w:color w:val="1F1F1F"/>
+          <w:kern w:val="0"/>
+          <w:sz w:val="24"/>
+          <w:szCs w:val="24"/>
+          <w:lang w:eastAsia="pt-BR"/>
+          <w14:ligatures w14:val="none"/>
+        </w:rPr>
+        <w:t>) &gt; (SELECT AVG(</w:t>
+      </w:r>
+      <w:proofErr w:type="spellStart"/>
+      <w:r>
+        <w:rPr>
+          <w:rFonts w:ascii="Arial" w:eastAsia="Times New Roman" w:hAnsi="Arial" w:cs="Arial"/>
+          <w:color w:val="1F1F1F"/>
+          <w:kern w:val="0"/>
+          <w:sz w:val="24"/>
+          <w:szCs w:val="24"/>
+          <w:lang w:eastAsia="pt-BR"/>
+          <w14:ligatures w14:val="none"/>
+        </w:rPr>
+        <w:t>s.salario</w:t>
+      </w:r>
+      <w:proofErr w:type="spellEnd"/>
+      <w:r>
+        <w:rPr>
+          <w:rFonts w:ascii="Arial" w:eastAsia="Times New Roman" w:hAnsi="Arial" w:cs="Arial"/>
+          <w:color w:val="1F1F1F"/>
+          <w:kern w:val="0"/>
+          <w:sz w:val="24"/>
+          <w:szCs w:val="24"/>
+          <w:lang w:eastAsia="pt-BR"/>
+          <w14:ligatures w14:val="none"/>
+        </w:rPr>
+        <w:t xml:space="preserve"> - </w:t>
+      </w:r>
+      <w:proofErr w:type="spellStart"/>
+      <w:r>
+        <w:rPr>
+          <w:rFonts w:ascii="Arial" w:eastAsia="Times New Roman" w:hAnsi="Arial" w:cs="Arial"/>
+          <w:color w:val="1F1F1F"/>
+          <w:kern w:val="0"/>
+          <w:sz w:val="24"/>
+          <w:szCs w:val="24"/>
+          <w:lang w:eastAsia="pt-BR"/>
+          <w14:ligatures w14:val="none"/>
+        </w:rPr>
+        <w:t>s.salario_ano_passado</w:t>
+      </w:r>
+      <w:proofErr w:type="spellEnd"/>
+      <w:r>
+        <w:rPr>
+          <w:rFonts w:ascii="Arial" w:eastAsia="Times New Roman" w:hAnsi="Arial" w:cs="Arial"/>
+          <w:color w:val="1F1F1F"/>
+          <w:kern w:val="0"/>
+          <w:sz w:val="24"/>
+          <w:szCs w:val="24"/>
+          <w:lang w:eastAsia="pt-BR"/>
+          <w14:ligatures w14:val="none"/>
+        </w:rPr>
+        <w:t xml:space="preserve">) FROM </w:t>
+      </w:r>
+      <w:proofErr w:type="spellStart"/>
+      <w:r>
+        <w:rPr>
+          <w:rFonts w:ascii="Arial" w:eastAsia="Times New Roman" w:hAnsi="Arial" w:cs="Arial"/>
+          <w:color w:val="1F1F1F"/>
+          <w:kern w:val="0"/>
+          <w:sz w:val="24"/>
+          <w:szCs w:val="24"/>
+          <w:lang w:eastAsia="pt-BR"/>
+          <w14:ligatures w14:val="none"/>
+        </w:rPr>
+        <w:t>funcionarios</w:t>
+      </w:r>
+      <w:proofErr w:type="spellEnd"/>
+      <w:r>
+        <w:rPr>
+          <w:rFonts w:ascii="Arial" w:eastAsia="Times New Roman" w:hAnsi="Arial" w:cs="Arial"/>
+          <w:color w:val="1F1F1F"/>
+          <w:kern w:val="0"/>
+          <w:sz w:val="24"/>
+          <w:szCs w:val="24"/>
+          <w:lang w:eastAsia="pt-BR"/>
+          <w14:ligatures w14:val="none"/>
+        </w:rPr>
+        <w:t xml:space="preserve"> s);</w:t>
+      </w:r>
+    </w:p>
+    <w:p>
+      <w:pPr>
+        <w:pStyle w:val="PargrafodaLista"/>
+        <w:spacing w:after="0" w:line="420" w:lineRule="atLeast"/>
+        <w:rPr>
+          <w:rFonts w:ascii="Arial" w:eastAsia="Times New Roman" w:hAnsi="Arial" w:cs="Arial"/>
+          <w:color w:val="1F1F1F"/>
+          <w:kern w:val="0"/>
+          <w:sz w:val="24"/>
+          <w:szCs w:val="24"/>
+          <w:lang w:eastAsia="pt-BR"/>
+          <w14:ligatures w14:val="none"/>
+        </w:rPr>
+      </w:pPr>
+    </w:p>
+    <w:p>
+      <w:pPr>
+        <w:pStyle w:val="PargrafodaLista"/>
+        <w:numPr>
+          <w:ilvl w:val="0"/>
+          <w:numId w:val="3"/>
+        </w:numPr>
+        <w:spacing w:after="0" w:line="420" w:lineRule="atLeast"/>
         <w:rPr>
           <w:rFonts w:ascii="Arial" w:eastAsia="Times New Roman" w:hAnsi="Arial" w:cs="Arial"/>
           <w:b/>
@@ -552,27 +2745,28 @@
           <w:kern w:val="0"/>
           <w:sz w:val="24"/>
           <w:szCs w:val="24"/>
-          <w:bdr w:val="none" w:sz="0" w:space="0" w:color="auto" w:frame="1"/>
-          <w:lang w:eastAsia="pt-BR"/>
-          <w14:ligatures w14:val="none"/>
-        </w:rPr>
-        <w:t>12.</w:t>
-      </w:r>
-      <w:r>
-        <w:rPr>
-          <w:rFonts w:ascii="Arial" w:eastAsia="Times New Roman" w:hAnsi="Arial" w:cs="Arial"/>
-          <w:color w:val="1F1F1F"/>
-          <w:kern w:val="0"/>
-          <w:sz w:val="24"/>
-          <w:szCs w:val="24"/>
-          <w:lang w:eastAsia="pt-BR"/>
-          <w14:ligatures w14:val="none"/>
-        </w:rPr>
-        <w:t xml:space="preserve"> Encontre os funcionários que tiveram um aumento salarial superior à média da empresa no último ano.</w:t>
+          <w:lang w:eastAsia="pt-BR"/>
+          <w14:ligatures w14:val="none"/>
+        </w:rPr>
+      </w:pPr>
+      <w:r>
+        <w:rPr>
+          <w:rFonts w:ascii="Arial" w:eastAsia="Times New Roman" w:hAnsi="Arial" w:cs="Arial"/>
+          <w:b/>
+          <w:bCs/>
+          <w:color w:val="1F1F1F"/>
+          <w:kern w:val="0"/>
+          <w:sz w:val="24"/>
+          <w:szCs w:val="24"/>
+          <w:lang w:eastAsia="pt-BR"/>
+          <w14:ligatures w14:val="none"/>
+        </w:rPr>
+        <w:t>Liste os países com mais de 5 funcionários e a média salarial por país.</w:t>
       </w:r>
     </w:p>
     <w:p>
       <w:pPr>
+        <w:pStyle w:val="PargrafodaLista"/>
         <w:spacing w:after="0" w:line="420" w:lineRule="atLeast"/>
         <w:rPr>
           <w:rFonts w:ascii="Arial" w:eastAsia="Times New Roman" w:hAnsi="Arial" w:cs="Arial"/>
@@ -585,6 +2779,251 @@
         </w:rPr>
       </w:pPr>
       <w:r>
+        <w:rPr>
+          <w:rFonts w:ascii="Arial" w:eastAsia="Times New Roman" w:hAnsi="Arial" w:cs="Arial"/>
+          <w:color w:val="1F1F1F"/>
+          <w:kern w:val="0"/>
+          <w:sz w:val="24"/>
+          <w:szCs w:val="24"/>
+          <w:lang w:eastAsia="pt-BR"/>
+          <w14:ligatures w14:val="none"/>
+        </w:rPr>
+        <w:t xml:space="preserve">SELECT </w:t>
+      </w:r>
+      <w:proofErr w:type="spellStart"/>
+      <w:proofErr w:type="gramStart"/>
+      <w:r>
+        <w:rPr>
+          <w:rFonts w:ascii="Arial" w:eastAsia="Times New Roman" w:hAnsi="Arial" w:cs="Arial"/>
+          <w:color w:val="1F1F1F"/>
+          <w:kern w:val="0"/>
+          <w:sz w:val="24"/>
+          <w:szCs w:val="24"/>
+          <w:lang w:eastAsia="pt-BR"/>
+          <w14:ligatures w14:val="none"/>
+        </w:rPr>
+        <w:t>p.nome</w:t>
+      </w:r>
+      <w:proofErr w:type="spellEnd"/>
+      <w:proofErr w:type="gramEnd"/>
+      <w:r>
+        <w:rPr>
+          <w:rFonts w:ascii="Arial" w:eastAsia="Times New Roman" w:hAnsi="Arial" w:cs="Arial"/>
+          <w:color w:val="1F1F1F"/>
+          <w:kern w:val="0"/>
+          <w:sz w:val="24"/>
+          <w:szCs w:val="24"/>
+          <w:lang w:eastAsia="pt-BR"/>
+          <w14:ligatures w14:val="none"/>
+        </w:rPr>
+        <w:t xml:space="preserve">, COUNT(f.id) AS </w:t>
+      </w:r>
+      <w:proofErr w:type="spellStart"/>
+      <w:r>
+        <w:rPr>
+          <w:rFonts w:ascii="Arial" w:eastAsia="Times New Roman" w:hAnsi="Arial" w:cs="Arial"/>
+          <w:color w:val="1F1F1F"/>
+          <w:kern w:val="0"/>
+          <w:sz w:val="24"/>
+          <w:szCs w:val="24"/>
+          <w:lang w:eastAsia="pt-BR"/>
+          <w14:ligatures w14:val="none"/>
+        </w:rPr>
+        <w:t>num_funcionarios</w:t>
+      </w:r>
+      <w:proofErr w:type="spellEnd"/>
+      <w:r>
+        <w:rPr>
+          <w:rFonts w:ascii="Arial" w:eastAsia="Times New Roman" w:hAnsi="Arial" w:cs="Arial"/>
+          <w:color w:val="1F1F1F"/>
+          <w:kern w:val="0"/>
+          <w:sz w:val="24"/>
+          <w:szCs w:val="24"/>
+          <w:lang w:eastAsia="pt-BR"/>
+          <w14:ligatures w14:val="none"/>
+        </w:rPr>
+        <w:t>, AVG(</w:t>
+      </w:r>
+      <w:proofErr w:type="spellStart"/>
+      <w:r>
+        <w:rPr>
+          <w:rFonts w:ascii="Arial" w:eastAsia="Times New Roman" w:hAnsi="Arial" w:cs="Arial"/>
+          <w:color w:val="1F1F1F"/>
+          <w:kern w:val="0"/>
+          <w:sz w:val="24"/>
+          <w:szCs w:val="24"/>
+          <w:lang w:eastAsia="pt-BR"/>
+          <w14:ligatures w14:val="none"/>
+        </w:rPr>
+        <w:t>f.salario</w:t>
+      </w:r>
+      <w:proofErr w:type="spellEnd"/>
+      <w:r>
+        <w:rPr>
+          <w:rFonts w:ascii="Arial" w:eastAsia="Times New Roman" w:hAnsi="Arial" w:cs="Arial"/>
+          <w:color w:val="1F1F1F"/>
+          <w:kern w:val="0"/>
+          <w:sz w:val="24"/>
+          <w:szCs w:val="24"/>
+          <w:lang w:eastAsia="pt-BR"/>
+          <w14:ligatures w14:val="none"/>
+        </w:rPr>
+        <w:t xml:space="preserve">) AS </w:t>
+      </w:r>
+      <w:proofErr w:type="spellStart"/>
+      <w:r>
+        <w:rPr>
+          <w:rFonts w:ascii="Arial" w:eastAsia="Times New Roman" w:hAnsi="Arial" w:cs="Arial"/>
+          <w:color w:val="1F1F1F"/>
+          <w:kern w:val="0"/>
+          <w:sz w:val="24"/>
+          <w:szCs w:val="24"/>
+          <w:lang w:eastAsia="pt-BR"/>
+          <w14:ligatures w14:val="none"/>
+        </w:rPr>
+        <w:t>media_salarial</w:t>
+      </w:r>
+      <w:proofErr w:type="spellEnd"/>
+      <w:r>
+        <w:rPr>
+          <w:rFonts w:ascii="Arial" w:eastAsia="Times New Roman" w:hAnsi="Arial" w:cs="Arial"/>
+          <w:color w:val="1F1F1F"/>
+          <w:kern w:val="0"/>
+          <w:sz w:val="24"/>
+          <w:szCs w:val="24"/>
+          <w:lang w:eastAsia="pt-BR"/>
+          <w14:ligatures w14:val="none"/>
+        </w:rPr>
+        <w:t xml:space="preserve"> FROM </w:t>
+      </w:r>
+      <w:proofErr w:type="spellStart"/>
+      <w:r>
+        <w:rPr>
+          <w:rFonts w:ascii="Arial" w:eastAsia="Times New Roman" w:hAnsi="Arial" w:cs="Arial"/>
+          <w:color w:val="1F1F1F"/>
+          <w:kern w:val="0"/>
+          <w:sz w:val="24"/>
+          <w:szCs w:val="24"/>
+          <w:lang w:eastAsia="pt-BR"/>
+          <w14:ligatures w14:val="none"/>
+        </w:rPr>
+        <w:t>paises</w:t>
+      </w:r>
+      <w:proofErr w:type="spellEnd"/>
+      <w:r>
+        <w:rPr>
+          <w:rFonts w:ascii="Arial" w:eastAsia="Times New Roman" w:hAnsi="Arial" w:cs="Arial"/>
+          <w:color w:val="1F1F1F"/>
+          <w:kern w:val="0"/>
+          <w:sz w:val="24"/>
+          <w:szCs w:val="24"/>
+          <w:lang w:eastAsia="pt-BR"/>
+          <w14:ligatures w14:val="none"/>
+        </w:rPr>
+        <w:t xml:space="preserve"> p INNER JOIN </w:t>
+      </w:r>
+      <w:proofErr w:type="spellStart"/>
+      <w:r>
+        <w:rPr>
+          <w:rFonts w:ascii="Arial" w:eastAsia="Times New Roman" w:hAnsi="Arial" w:cs="Arial"/>
+          <w:color w:val="1F1F1F"/>
+          <w:kern w:val="0"/>
+          <w:sz w:val="24"/>
+          <w:szCs w:val="24"/>
+          <w:lang w:eastAsia="pt-BR"/>
+          <w14:ligatures w14:val="none"/>
+        </w:rPr>
+        <w:t>funcionarios</w:t>
+      </w:r>
+      <w:proofErr w:type="spellEnd"/>
+      <w:r>
+        <w:rPr>
+          <w:rFonts w:ascii="Arial" w:eastAsia="Times New Roman" w:hAnsi="Arial" w:cs="Arial"/>
+          <w:color w:val="1F1F1F"/>
+          <w:kern w:val="0"/>
+          <w:sz w:val="24"/>
+          <w:szCs w:val="24"/>
+          <w:lang w:eastAsia="pt-BR"/>
+          <w14:ligatures w14:val="none"/>
+        </w:rPr>
+        <w:t xml:space="preserve"> f ON p.id = </w:t>
+      </w:r>
+      <w:proofErr w:type="spellStart"/>
+      <w:r>
+        <w:rPr>
+          <w:rFonts w:ascii="Arial" w:eastAsia="Times New Roman" w:hAnsi="Arial" w:cs="Arial"/>
+          <w:color w:val="1F1F1F"/>
+          <w:kern w:val="0"/>
+          <w:sz w:val="24"/>
+          <w:szCs w:val="24"/>
+          <w:lang w:eastAsia="pt-BR"/>
+          <w14:ligatures w14:val="none"/>
+        </w:rPr>
+        <w:t>f.pais_id</w:t>
+      </w:r>
+      <w:proofErr w:type="spellEnd"/>
+      <w:r>
+        <w:rPr>
+          <w:rFonts w:ascii="Arial" w:eastAsia="Times New Roman" w:hAnsi="Arial" w:cs="Arial"/>
+          <w:color w:val="1F1F1F"/>
+          <w:kern w:val="0"/>
+          <w:sz w:val="24"/>
+          <w:szCs w:val="24"/>
+          <w:lang w:eastAsia="pt-BR"/>
+          <w14:ligatures w14:val="none"/>
+        </w:rPr>
+        <w:t xml:space="preserve"> GROUP BY </w:t>
+      </w:r>
+      <w:proofErr w:type="spellStart"/>
+      <w:r>
+        <w:rPr>
+          <w:rFonts w:ascii="Arial" w:eastAsia="Times New Roman" w:hAnsi="Arial" w:cs="Arial"/>
+          <w:color w:val="1F1F1F"/>
+          <w:kern w:val="0"/>
+          <w:sz w:val="24"/>
+          <w:szCs w:val="24"/>
+          <w:lang w:eastAsia="pt-BR"/>
+          <w14:ligatures w14:val="none"/>
+        </w:rPr>
+        <w:t>p.nome</w:t>
+      </w:r>
+      <w:proofErr w:type="spellEnd"/>
+      <w:r>
+        <w:rPr>
+          <w:rFonts w:ascii="Arial" w:eastAsia="Times New Roman" w:hAnsi="Arial" w:cs="Arial"/>
+          <w:color w:val="1F1F1F"/>
+          <w:kern w:val="0"/>
+          <w:sz w:val="24"/>
+          <w:szCs w:val="24"/>
+          <w:lang w:eastAsia="pt-BR"/>
+          <w14:ligatures w14:val="none"/>
+        </w:rPr>
+        <w:t xml:space="preserve"> HAVING COUNT(f.id) &gt; 5;</w:t>
+      </w:r>
+    </w:p>
+    <w:p>
+      <w:pPr>
+        <w:pStyle w:val="PargrafodaLista"/>
+        <w:spacing w:after="0" w:line="420" w:lineRule="atLeast"/>
+        <w:rPr>
+          <w:rFonts w:ascii="Arial" w:eastAsia="Times New Roman" w:hAnsi="Arial" w:cs="Arial"/>
+          <w:color w:val="1F1F1F"/>
+          <w:kern w:val="0"/>
+          <w:sz w:val="24"/>
+          <w:szCs w:val="24"/>
+          <w:lang w:eastAsia="pt-BR"/>
+          <w14:ligatures w14:val="none"/>
+        </w:rPr>
+      </w:pPr>
+    </w:p>
+    <w:p>
+      <w:pPr>
+        <w:pStyle w:val="PargrafodaLista"/>
+        <w:numPr>
+          <w:ilvl w:val="0"/>
+          <w:numId w:val="3"/>
+        </w:numPr>
+        <w:spacing w:after="0" w:line="420" w:lineRule="atLeast"/>
         <w:rPr>
           <w:rFonts w:ascii="Arial" w:eastAsia="Times New Roman" w:hAnsi="Arial" w:cs="Arial"/>
           <w:b/>
@@ -593,27 +3032,28 @@
           <w:kern w:val="0"/>
           <w:sz w:val="24"/>
           <w:szCs w:val="24"/>
-          <w:bdr w:val="none" w:sz="0" w:space="0" w:color="auto" w:frame="1"/>
-          <w:lang w:eastAsia="pt-BR"/>
-          <w14:ligatures w14:val="none"/>
-        </w:rPr>
-        <w:t>13.</w:t>
-      </w:r>
-      <w:r>
-        <w:rPr>
-          <w:rFonts w:ascii="Arial" w:eastAsia="Times New Roman" w:hAnsi="Arial" w:cs="Arial"/>
-          <w:color w:val="1F1F1F"/>
-          <w:kern w:val="0"/>
-          <w:sz w:val="24"/>
-          <w:szCs w:val="24"/>
-          <w:lang w:eastAsia="pt-BR"/>
-          <w14:ligatures w14:val="none"/>
-        </w:rPr>
-        <w:t xml:space="preserve"> Liste os países com mais de 5 funcionários e a média salarial por país.</w:t>
+          <w:lang w:eastAsia="pt-BR"/>
+          <w14:ligatures w14:val="none"/>
+        </w:rPr>
+      </w:pPr>
+      <w:r>
+        <w:rPr>
+          <w:rFonts w:ascii="Arial" w:eastAsia="Times New Roman" w:hAnsi="Arial" w:cs="Arial"/>
+          <w:b/>
+          <w:bCs/>
+          <w:color w:val="1F1F1F"/>
+          <w:kern w:val="0"/>
+          <w:sz w:val="24"/>
+          <w:szCs w:val="24"/>
+          <w:lang w:eastAsia="pt-BR"/>
+          <w14:ligatures w14:val="none"/>
+        </w:rPr>
+        <w:t>Identifique os cargos com a maior e a menor faixa salarial.</w:t>
       </w:r>
     </w:p>
     <w:p>
       <w:pPr>
+        <w:pStyle w:val="PargrafodaLista"/>
         <w:spacing w:after="0" w:line="420" w:lineRule="atLeast"/>
         <w:rPr>
           <w:rFonts w:ascii="Arial" w:eastAsia="Times New Roman" w:hAnsi="Arial" w:cs="Arial"/>
@@ -626,6 +3066,277 @@
         </w:rPr>
       </w:pPr>
       <w:r>
+        <w:rPr>
+          <w:rFonts w:ascii="Arial" w:eastAsia="Times New Roman" w:hAnsi="Arial" w:cs="Arial"/>
+          <w:color w:val="1F1F1F"/>
+          <w:kern w:val="0"/>
+          <w:sz w:val="24"/>
+          <w:szCs w:val="24"/>
+          <w:lang w:eastAsia="pt-BR"/>
+          <w14:ligatures w14:val="none"/>
+        </w:rPr>
+        <w:t xml:space="preserve">SELECT </w:t>
+      </w:r>
+      <w:proofErr w:type="spellStart"/>
+      <w:proofErr w:type="gramStart"/>
+      <w:r>
+        <w:rPr>
+          <w:rFonts w:ascii="Arial" w:eastAsia="Times New Roman" w:hAnsi="Arial" w:cs="Arial"/>
+          <w:color w:val="1F1F1F"/>
+          <w:kern w:val="0"/>
+          <w:sz w:val="24"/>
+          <w:szCs w:val="24"/>
+          <w:lang w:eastAsia="pt-BR"/>
+          <w14:ligatures w14:val="none"/>
+        </w:rPr>
+        <w:t>c.nome</w:t>
+      </w:r>
+      <w:proofErr w:type="spellEnd"/>
+      <w:proofErr w:type="gramEnd"/>
+      <w:r>
+        <w:rPr>
+          <w:rFonts w:ascii="Arial" w:eastAsia="Times New Roman" w:hAnsi="Arial" w:cs="Arial"/>
+          <w:color w:val="1F1F1F"/>
+          <w:kern w:val="0"/>
+          <w:sz w:val="24"/>
+          <w:szCs w:val="24"/>
+          <w:lang w:eastAsia="pt-BR"/>
+          <w14:ligatures w14:val="none"/>
+        </w:rPr>
+        <w:t>, MIN(</w:t>
+      </w:r>
+      <w:proofErr w:type="spellStart"/>
+      <w:r>
+        <w:rPr>
+          <w:rFonts w:ascii="Arial" w:eastAsia="Times New Roman" w:hAnsi="Arial" w:cs="Arial"/>
+          <w:color w:val="1F1F1F"/>
+          <w:kern w:val="0"/>
+          <w:sz w:val="24"/>
+          <w:szCs w:val="24"/>
+          <w:lang w:eastAsia="pt-BR"/>
+          <w14:ligatures w14:val="none"/>
+        </w:rPr>
+        <w:t>f.salario</w:t>
+      </w:r>
+      <w:proofErr w:type="spellEnd"/>
+      <w:r>
+        <w:rPr>
+          <w:rFonts w:ascii="Arial" w:eastAsia="Times New Roman" w:hAnsi="Arial" w:cs="Arial"/>
+          <w:color w:val="1F1F1F"/>
+          <w:kern w:val="0"/>
+          <w:sz w:val="24"/>
+          <w:szCs w:val="24"/>
+          <w:lang w:eastAsia="pt-BR"/>
+          <w14:ligatures w14:val="none"/>
+        </w:rPr>
+        <w:t xml:space="preserve">) AS </w:t>
+      </w:r>
+      <w:proofErr w:type="spellStart"/>
+      <w:r>
+        <w:rPr>
+          <w:rFonts w:ascii="Arial" w:eastAsia="Times New Roman" w:hAnsi="Arial" w:cs="Arial"/>
+          <w:color w:val="1F1F1F"/>
+          <w:kern w:val="0"/>
+          <w:sz w:val="24"/>
+          <w:szCs w:val="24"/>
+          <w:lang w:eastAsia="pt-BR"/>
+          <w14:ligatures w14:val="none"/>
+        </w:rPr>
+        <w:t>menor_salario</w:t>
+      </w:r>
+      <w:proofErr w:type="spellEnd"/>
+      <w:r>
+        <w:rPr>
+          <w:rFonts w:ascii="Arial" w:eastAsia="Times New Roman" w:hAnsi="Arial" w:cs="Arial"/>
+          <w:color w:val="1F1F1F"/>
+          <w:kern w:val="0"/>
+          <w:sz w:val="24"/>
+          <w:szCs w:val="24"/>
+          <w:lang w:eastAsia="pt-BR"/>
+          <w14:ligatures w14:val="none"/>
+        </w:rPr>
+        <w:t>, MAX(</w:t>
+      </w:r>
+      <w:proofErr w:type="spellStart"/>
+      <w:r>
+        <w:rPr>
+          <w:rFonts w:ascii="Arial" w:eastAsia="Times New Roman" w:hAnsi="Arial" w:cs="Arial"/>
+          <w:color w:val="1F1F1F"/>
+          <w:kern w:val="0"/>
+          <w:sz w:val="24"/>
+          <w:szCs w:val="24"/>
+          <w:lang w:eastAsia="pt-BR"/>
+          <w14:ligatures w14:val="none"/>
+        </w:rPr>
+        <w:t>f.salario</w:t>
+      </w:r>
+      <w:proofErr w:type="spellEnd"/>
+      <w:r>
+        <w:rPr>
+          <w:rFonts w:ascii="Arial" w:eastAsia="Times New Roman" w:hAnsi="Arial" w:cs="Arial"/>
+          <w:color w:val="1F1F1F"/>
+          <w:kern w:val="0"/>
+          <w:sz w:val="24"/>
+          <w:szCs w:val="24"/>
+          <w:lang w:eastAsia="pt-BR"/>
+          <w14:ligatures w14:val="none"/>
+        </w:rPr>
+        <w:t xml:space="preserve">) AS </w:t>
+      </w:r>
+      <w:proofErr w:type="spellStart"/>
+      <w:r>
+        <w:rPr>
+          <w:rFonts w:ascii="Arial" w:eastAsia="Times New Roman" w:hAnsi="Arial" w:cs="Arial"/>
+          <w:color w:val="1F1F1F"/>
+          <w:kern w:val="0"/>
+          <w:sz w:val="24"/>
+          <w:szCs w:val="24"/>
+          <w:lang w:eastAsia="pt-BR"/>
+          <w14:ligatures w14:val="none"/>
+        </w:rPr>
+        <w:t>maior_salario</w:t>
+      </w:r>
+      <w:proofErr w:type="spellEnd"/>
+      <w:r>
+        <w:rPr>
+          <w:rFonts w:ascii="Arial" w:eastAsia="Times New Roman" w:hAnsi="Arial" w:cs="Arial"/>
+          <w:color w:val="1F1F1F"/>
+          <w:kern w:val="0"/>
+          <w:sz w:val="24"/>
+          <w:szCs w:val="24"/>
+          <w:lang w:eastAsia="pt-BR"/>
+          <w14:ligatures w14:val="none"/>
+        </w:rPr>
+        <w:t xml:space="preserve"> FROM cargos c INNER JOIN </w:t>
+      </w:r>
+      <w:proofErr w:type="spellStart"/>
+      <w:r>
+        <w:rPr>
+          <w:rFonts w:ascii="Arial" w:eastAsia="Times New Roman" w:hAnsi="Arial" w:cs="Arial"/>
+          <w:color w:val="1F1F1F"/>
+          <w:kern w:val="0"/>
+          <w:sz w:val="24"/>
+          <w:szCs w:val="24"/>
+          <w:lang w:eastAsia="pt-BR"/>
+          <w14:ligatures w14:val="none"/>
+        </w:rPr>
+        <w:t>funcionarios</w:t>
+      </w:r>
+      <w:proofErr w:type="spellEnd"/>
+      <w:r>
+        <w:rPr>
+          <w:rFonts w:ascii="Arial" w:eastAsia="Times New Roman" w:hAnsi="Arial" w:cs="Arial"/>
+          <w:color w:val="1F1F1F"/>
+          <w:kern w:val="0"/>
+          <w:sz w:val="24"/>
+          <w:szCs w:val="24"/>
+          <w:lang w:eastAsia="pt-BR"/>
+          <w14:ligatures w14:val="none"/>
+        </w:rPr>
+        <w:t xml:space="preserve"> f ON c.id = </w:t>
+      </w:r>
+      <w:proofErr w:type="spellStart"/>
+      <w:r>
+        <w:rPr>
+          <w:rFonts w:ascii="Arial" w:eastAsia="Times New Roman" w:hAnsi="Arial" w:cs="Arial"/>
+          <w:color w:val="1F1F1F"/>
+          <w:kern w:val="0"/>
+          <w:sz w:val="24"/>
+          <w:szCs w:val="24"/>
+          <w:lang w:eastAsia="pt-BR"/>
+          <w14:ligatures w14:val="none"/>
+        </w:rPr>
+        <w:t>f.cargo_id</w:t>
+      </w:r>
+      <w:proofErr w:type="spellEnd"/>
+      <w:r>
+        <w:rPr>
+          <w:rFonts w:ascii="Arial" w:eastAsia="Times New Roman" w:hAnsi="Arial" w:cs="Arial"/>
+          <w:color w:val="1F1F1F"/>
+          <w:kern w:val="0"/>
+          <w:sz w:val="24"/>
+          <w:szCs w:val="24"/>
+          <w:lang w:eastAsia="pt-BR"/>
+          <w14:ligatures w14:val="none"/>
+        </w:rPr>
+        <w:t xml:space="preserve"> GROUP BY </w:t>
+      </w:r>
+      <w:proofErr w:type="spellStart"/>
+      <w:r>
+        <w:rPr>
+          <w:rFonts w:ascii="Arial" w:eastAsia="Times New Roman" w:hAnsi="Arial" w:cs="Arial"/>
+          <w:color w:val="1F1F1F"/>
+          <w:kern w:val="0"/>
+          <w:sz w:val="24"/>
+          <w:szCs w:val="24"/>
+          <w:lang w:eastAsia="pt-BR"/>
+          <w14:ligatures w14:val="none"/>
+        </w:rPr>
+        <w:t>c.nome</w:t>
+      </w:r>
+      <w:proofErr w:type="spellEnd"/>
+      <w:r>
+        <w:rPr>
+          <w:rFonts w:ascii="Arial" w:eastAsia="Times New Roman" w:hAnsi="Arial" w:cs="Arial"/>
+          <w:color w:val="1F1F1F"/>
+          <w:kern w:val="0"/>
+          <w:sz w:val="24"/>
+          <w:szCs w:val="24"/>
+          <w:lang w:eastAsia="pt-BR"/>
+          <w14:ligatures w14:val="none"/>
+        </w:rPr>
+        <w:t xml:space="preserve"> ORDER BY </w:t>
+      </w:r>
+      <w:proofErr w:type="spellStart"/>
+      <w:r>
+        <w:rPr>
+          <w:rFonts w:ascii="Arial" w:eastAsia="Times New Roman" w:hAnsi="Arial" w:cs="Arial"/>
+          <w:color w:val="1F1F1F"/>
+          <w:kern w:val="0"/>
+          <w:sz w:val="24"/>
+          <w:szCs w:val="24"/>
+          <w:lang w:eastAsia="pt-BR"/>
+          <w14:ligatures w14:val="none"/>
+        </w:rPr>
+        <w:t>maior_salario</w:t>
+      </w:r>
+      <w:proofErr w:type="spellEnd"/>
+      <w:r>
+        <w:rPr>
+          <w:rFonts w:ascii="Arial" w:eastAsia="Times New Roman" w:hAnsi="Arial" w:cs="Arial"/>
+          <w:color w:val="1F1F1F"/>
+          <w:kern w:val="0"/>
+          <w:sz w:val="24"/>
+          <w:szCs w:val="24"/>
+          <w:lang w:eastAsia="pt-BR"/>
+          <w14:ligatures w14:val="none"/>
+        </w:rPr>
+        <w:t xml:space="preserve"> DESC;</w:t>
+      </w:r>
+    </w:p>
+    <w:p>
+      <w:pPr>
+        <w:pStyle w:val="PargrafodaLista"/>
+        <w:spacing w:after="0" w:line="420" w:lineRule="atLeast"/>
+        <w:rPr>
+          <w:rFonts w:ascii="Arial" w:eastAsia="Times New Roman" w:hAnsi="Arial" w:cs="Arial"/>
+          <w:color w:val="1F1F1F"/>
+          <w:kern w:val="0"/>
+          <w:sz w:val="24"/>
+          <w:szCs w:val="24"/>
+          <w:lang w:eastAsia="pt-BR"/>
+          <w14:ligatures w14:val="none"/>
+        </w:rPr>
+      </w:pPr>
+    </w:p>
+    <w:p>
+      <w:pPr>
+        <w:pStyle w:val="PargrafodaLista"/>
+        <w:numPr>
+          <w:ilvl w:val="0"/>
+          <w:numId w:val="3"/>
+        </w:numPr>
+        <w:spacing w:after="0" w:line="420" w:lineRule="atLeast"/>
         <w:rPr>
           <w:rFonts w:ascii="Arial" w:eastAsia="Times New Roman" w:hAnsi="Arial" w:cs="Arial"/>
           <w:b/>
@@ -634,27 +3345,306 @@
           <w:kern w:val="0"/>
           <w:sz w:val="24"/>
           <w:szCs w:val="24"/>
-          <w:bdr w:val="none" w:sz="0" w:space="0" w:color="auto" w:frame="1"/>
-          <w:lang w:eastAsia="pt-BR"/>
-          <w14:ligatures w14:val="none"/>
-        </w:rPr>
-        <w:t>14.</w:t>
-      </w:r>
-      <w:r>
-        <w:rPr>
-          <w:rFonts w:ascii="Arial" w:eastAsia="Times New Roman" w:hAnsi="Arial" w:cs="Arial"/>
-          <w:color w:val="1F1F1F"/>
-          <w:kern w:val="0"/>
-          <w:sz w:val="24"/>
-          <w:szCs w:val="24"/>
-          <w:lang w:eastAsia="pt-BR"/>
-          <w14:ligatures w14:val="none"/>
-        </w:rPr>
-        <w:t xml:space="preserve"> Identifique os cargos com a maior e a menor faixa salarial.</w:t>
+          <w:lang w:eastAsia="pt-BR"/>
+          <w14:ligatures w14:val="none"/>
+        </w:rPr>
+      </w:pPr>
+      <w:r>
+        <w:rPr>
+          <w:rFonts w:ascii="Arial" w:eastAsia="Times New Roman" w:hAnsi="Arial" w:cs="Arial"/>
+          <w:b/>
+          <w:bCs/>
+          <w:color w:val="1F1F1F"/>
+          <w:kern w:val="0"/>
+          <w:sz w:val="24"/>
+          <w:szCs w:val="24"/>
+          <w:lang w:eastAsia="pt-BR"/>
+          <w14:ligatures w14:val="none"/>
+        </w:rPr>
+        <w:t>Calcule o total de vendas por cliente e segmente os clientes em categorias (bronze, prata, ouro) de acordo com o valor total das suas compras.</w:t>
       </w:r>
     </w:p>
     <w:p>
       <w:pPr>
+        <w:pStyle w:val="PargrafodaLista"/>
+        <w:spacing w:after="0" w:line="420" w:lineRule="atLeast"/>
+        <w:rPr>
+          <w:rFonts w:ascii="Arial" w:eastAsia="Times New Roman" w:hAnsi="Arial" w:cs="Arial"/>
+          <w:color w:val="1F1F1F"/>
+          <w:kern w:val="0"/>
+          <w:sz w:val="24"/>
+          <w:szCs w:val="24"/>
+          <w:lang w:eastAsia="pt-BR"/>
+          <w14:ligatures w14:val="none"/>
+        </w:rPr>
+      </w:pPr>
+      <w:r>
+        <w:rPr>
+          <w:rFonts w:ascii="Arial" w:eastAsia="Times New Roman" w:hAnsi="Arial" w:cs="Arial"/>
+          <w:color w:val="1F1F1F"/>
+          <w:kern w:val="0"/>
+          <w:sz w:val="24"/>
+          <w:szCs w:val="24"/>
+          <w:lang w:eastAsia="pt-BR"/>
+          <w14:ligatures w14:val="none"/>
+        </w:rPr>
+        <w:t xml:space="preserve">SELECT </w:t>
+      </w:r>
+      <w:proofErr w:type="spellStart"/>
+      <w:proofErr w:type="gramStart"/>
+      <w:r>
+        <w:rPr>
+          <w:rFonts w:ascii="Arial" w:eastAsia="Times New Roman" w:hAnsi="Arial" w:cs="Arial"/>
+          <w:color w:val="1F1F1F"/>
+          <w:kern w:val="0"/>
+          <w:sz w:val="24"/>
+          <w:szCs w:val="24"/>
+          <w:lang w:eastAsia="pt-BR"/>
+          <w14:ligatures w14:val="none"/>
+        </w:rPr>
+        <w:t>c.nome</w:t>
+      </w:r>
+      <w:proofErr w:type="spellEnd"/>
+      <w:proofErr w:type="gramEnd"/>
+      <w:r>
+        <w:rPr>
+          <w:rFonts w:ascii="Arial" w:eastAsia="Times New Roman" w:hAnsi="Arial" w:cs="Arial"/>
+          <w:color w:val="1F1F1F"/>
+          <w:kern w:val="0"/>
+          <w:sz w:val="24"/>
+          <w:szCs w:val="24"/>
+          <w:lang w:eastAsia="pt-BR"/>
+          <w14:ligatures w14:val="none"/>
+        </w:rPr>
+        <w:t>, SUM(</w:t>
+      </w:r>
+      <w:proofErr w:type="spellStart"/>
+      <w:r>
+        <w:rPr>
+          <w:rFonts w:ascii="Arial" w:eastAsia="Times New Roman" w:hAnsi="Arial" w:cs="Arial"/>
+          <w:color w:val="1F1F1F"/>
+          <w:kern w:val="0"/>
+          <w:sz w:val="24"/>
+          <w:szCs w:val="24"/>
+          <w:lang w:eastAsia="pt-BR"/>
+          <w14:ligatures w14:val="none"/>
+        </w:rPr>
+        <w:t>v.valor_venda</w:t>
+      </w:r>
+      <w:proofErr w:type="spellEnd"/>
+      <w:r>
+        <w:rPr>
+          <w:rFonts w:ascii="Arial" w:eastAsia="Times New Roman" w:hAnsi="Arial" w:cs="Arial"/>
+          <w:color w:val="1F1F1F"/>
+          <w:kern w:val="0"/>
+          <w:sz w:val="24"/>
+          <w:szCs w:val="24"/>
+          <w:lang w:eastAsia="pt-BR"/>
+          <w14:ligatures w14:val="none"/>
+        </w:rPr>
+        <w:t xml:space="preserve">) AS </w:t>
+      </w:r>
+      <w:proofErr w:type="spellStart"/>
+      <w:r>
+        <w:rPr>
+          <w:rFonts w:ascii="Arial" w:eastAsia="Times New Roman" w:hAnsi="Arial" w:cs="Arial"/>
+          <w:color w:val="1F1F1F"/>
+          <w:kern w:val="0"/>
+          <w:sz w:val="24"/>
+          <w:szCs w:val="24"/>
+          <w:lang w:eastAsia="pt-BR"/>
+          <w14:ligatures w14:val="none"/>
+        </w:rPr>
+        <w:t>total_compras</w:t>
+      </w:r>
+      <w:proofErr w:type="spellEnd"/>
+      <w:r>
+        <w:rPr>
+          <w:rFonts w:ascii="Arial" w:eastAsia="Times New Roman" w:hAnsi="Arial" w:cs="Arial"/>
+          <w:color w:val="1F1F1F"/>
+          <w:kern w:val="0"/>
+          <w:sz w:val="24"/>
+          <w:szCs w:val="24"/>
+          <w:lang w:eastAsia="pt-BR"/>
+          <w14:ligatures w14:val="none"/>
+        </w:rPr>
+        <w:t>, CASE WHEN SUM(</w:t>
+      </w:r>
+      <w:proofErr w:type="spellStart"/>
+      <w:r>
+        <w:rPr>
+          <w:rFonts w:ascii="Arial" w:eastAsia="Times New Roman" w:hAnsi="Arial" w:cs="Arial"/>
+          <w:color w:val="1F1F1F"/>
+          <w:kern w:val="0"/>
+          <w:sz w:val="24"/>
+          <w:szCs w:val="24"/>
+          <w:lang w:eastAsia="pt-BR"/>
+          <w14:ligatures w14:val="none"/>
+        </w:rPr>
+        <w:t>v.valor_venda</w:t>
+      </w:r>
+      <w:proofErr w:type="spellEnd"/>
+      <w:r>
+        <w:rPr>
+          <w:rFonts w:ascii="Arial" w:eastAsia="Times New Roman" w:hAnsi="Arial" w:cs="Arial"/>
+          <w:color w:val="1F1F1F"/>
+          <w:kern w:val="0"/>
+          <w:sz w:val="24"/>
+          <w:szCs w:val="24"/>
+          <w:lang w:eastAsia="pt-BR"/>
+          <w14:ligatures w14:val="none"/>
+        </w:rPr>
+        <w:t>) &gt;= 10000 THEN 'Ouro' WHEN SUM(</w:t>
+      </w:r>
+      <w:proofErr w:type="spellStart"/>
+      <w:r>
+        <w:rPr>
+          <w:rFonts w:ascii="Arial" w:eastAsia="Times New Roman" w:hAnsi="Arial" w:cs="Arial"/>
+          <w:color w:val="1F1F1F"/>
+          <w:kern w:val="0"/>
+          <w:sz w:val="24"/>
+          <w:szCs w:val="24"/>
+          <w:lang w:eastAsia="pt-BR"/>
+          <w14:ligatures w14:val="none"/>
+        </w:rPr>
+        <w:t>v.valor_venda</w:t>
+      </w:r>
+      <w:proofErr w:type="spellEnd"/>
+      <w:r>
+        <w:rPr>
+          <w:rFonts w:ascii="Arial" w:eastAsia="Times New Roman" w:hAnsi="Arial" w:cs="Arial"/>
+          <w:color w:val="1F1F1F"/>
+          <w:kern w:val="0"/>
+          <w:sz w:val="24"/>
+          <w:szCs w:val="24"/>
+          <w:lang w:eastAsia="pt-BR"/>
+          <w14:ligatures w14:val="none"/>
+        </w:rPr>
+        <w:t xml:space="preserve">) &gt;= 5000 THEN 'Prata' ELSE 'Bronze' END AS categoria FROM clientes c INNER JOIN vendas v ON c.id = </w:t>
+      </w:r>
+      <w:proofErr w:type="spellStart"/>
+      <w:r>
+        <w:rPr>
+          <w:rFonts w:ascii="Arial" w:eastAsia="Times New Roman" w:hAnsi="Arial" w:cs="Arial"/>
+          <w:color w:val="1F1F1F"/>
+          <w:kern w:val="0"/>
+          <w:sz w:val="24"/>
+          <w:szCs w:val="24"/>
+          <w:lang w:eastAsia="pt-BR"/>
+          <w14:ligatures w14:val="none"/>
+        </w:rPr>
+        <w:t>v.cliente_id</w:t>
+      </w:r>
+      <w:proofErr w:type="spellEnd"/>
+      <w:r>
+        <w:rPr>
+          <w:rFonts w:ascii="Arial" w:eastAsia="Times New Roman" w:hAnsi="Arial" w:cs="Arial"/>
+          <w:color w:val="1F1F1F"/>
+          <w:kern w:val="0"/>
+          <w:sz w:val="24"/>
+          <w:szCs w:val="24"/>
+          <w:lang w:eastAsia="pt-BR"/>
+          <w14:ligatures w14:val="none"/>
+        </w:rPr>
+        <w:t xml:space="preserve"> GROUP BY </w:t>
+      </w:r>
+      <w:proofErr w:type="spellStart"/>
+      <w:r>
+        <w:rPr>
+          <w:rFonts w:ascii="Arial" w:eastAsia="Times New Roman" w:hAnsi="Arial" w:cs="Arial"/>
+          <w:color w:val="1F1F1F"/>
+          <w:kern w:val="0"/>
+          <w:sz w:val="24"/>
+          <w:szCs w:val="24"/>
+          <w:lang w:eastAsia="pt-BR"/>
+          <w14:ligatures w14:val="none"/>
+        </w:rPr>
+        <w:t>c.nome</w:t>
+      </w:r>
+      <w:proofErr w:type="spellEnd"/>
+      <w:r>
+        <w:rPr>
+          <w:rFonts w:ascii="Arial" w:eastAsia="Times New Roman" w:hAnsi="Arial" w:cs="Arial"/>
+          <w:color w:val="1F1F1F"/>
+          <w:kern w:val="0"/>
+          <w:sz w:val="24"/>
+          <w:szCs w:val="24"/>
+          <w:lang w:eastAsia="pt-BR"/>
+          <w14:ligatures w14:val="none"/>
+        </w:rPr>
+        <w:t xml:space="preserve"> ORDER BY </w:t>
+      </w:r>
+      <w:proofErr w:type="spellStart"/>
+      <w:r>
+        <w:rPr>
+          <w:rFonts w:ascii="Arial" w:eastAsia="Times New Roman" w:hAnsi="Arial" w:cs="Arial"/>
+          <w:color w:val="1F1F1F"/>
+          <w:kern w:val="0"/>
+          <w:sz w:val="24"/>
+          <w:szCs w:val="24"/>
+          <w:lang w:eastAsia="pt-BR"/>
+          <w14:ligatures w14:val="none"/>
+        </w:rPr>
+        <w:t>total_compras</w:t>
+      </w:r>
+      <w:proofErr w:type="spellEnd"/>
+      <w:r>
+        <w:rPr>
+          <w:rFonts w:ascii="Arial" w:eastAsia="Times New Roman" w:hAnsi="Arial" w:cs="Arial"/>
+          <w:color w:val="1F1F1F"/>
+          <w:kern w:val="0"/>
+          <w:sz w:val="24"/>
+          <w:szCs w:val="24"/>
+          <w:lang w:eastAsia="pt-BR"/>
+          <w14:ligatures w14:val="none"/>
+        </w:rPr>
+        <w:t xml:space="preserve"> DESC;</w:t>
+      </w:r>
+    </w:p>
+    <w:p>
+      <w:pPr>
+        <w:spacing w:after="0" w:line="420" w:lineRule="atLeast"/>
+        <w:rPr>
+          <w:rFonts w:ascii="Arial" w:eastAsia="Times New Roman" w:hAnsi="Arial" w:cs="Arial"/>
+          <w:color w:val="1F1F1F"/>
+          <w:kern w:val="0"/>
+          <w:sz w:val="24"/>
+          <w:szCs w:val="24"/>
+          <w:lang w:eastAsia="pt-BR"/>
+          <w14:ligatures w14:val="none"/>
+        </w:rPr>
+      </w:pPr>
+    </w:p>
+    <w:p>
+      <w:pPr>
+        <w:spacing w:after="0" w:line="420" w:lineRule="atLeast"/>
+        <w:rPr>
+          <w:rFonts w:ascii="Arial" w:eastAsia="Times New Roman" w:hAnsi="Arial" w:cs="Arial"/>
+          <w:color w:val="1F1F1F"/>
+          <w:kern w:val="0"/>
+          <w:sz w:val="24"/>
+          <w:szCs w:val="24"/>
+          <w:lang w:eastAsia="pt-BR"/>
+          <w14:ligatures w14:val="none"/>
+        </w:rPr>
+      </w:pPr>
+    </w:p>
+    <w:p>
+      <w:pPr>
+        <w:spacing w:after="0" w:line="420" w:lineRule="atLeast"/>
+        <w:rPr>
+          <w:rFonts w:ascii="Arial" w:eastAsia="Times New Roman" w:hAnsi="Arial" w:cs="Arial"/>
+          <w:color w:val="1F1F1F"/>
+          <w:kern w:val="0"/>
+          <w:sz w:val="24"/>
+          <w:szCs w:val="24"/>
+          <w:lang w:eastAsia="pt-BR"/>
+          <w14:ligatures w14:val="none"/>
+        </w:rPr>
+      </w:pPr>
+    </w:p>
+    <w:p>
+      <w:pPr>
         <w:spacing w:after="0" w:line="420" w:lineRule="atLeast"/>
         <w:rPr>
           <w:rFonts w:ascii="Arial" w:eastAsia="Times New Roman" w:hAnsi="Arial" w:cs="Arial"/>
@@ -679,89 +3669,7 @@
           <w:lang w:eastAsia="pt-BR"/>
           <w14:ligatures w14:val="none"/>
         </w:rPr>
-        <w:t>15.</w:t>
-      </w:r>
-      <w:r>
-        <w:rPr>
-          <w:rFonts w:ascii="Arial" w:eastAsia="Times New Roman" w:hAnsi="Arial" w:cs="Arial"/>
-          <w:color w:val="1F1F1F"/>
-          <w:kern w:val="0"/>
-          <w:sz w:val="24"/>
-          <w:szCs w:val="24"/>
-          <w:lang w:eastAsia="pt-BR"/>
-          <w14:ligatures w14:val="none"/>
-        </w:rPr>
-        <w:t xml:space="preserve"> Calcule o total de vendas por cliente e segmente os clientes em categorias (bronze, prata, ouro) de acordo com o valor total das suas compras.</w:t>
-      </w:r>
-    </w:p>
-    <w:p>
-      <w:pPr>
-        <w:spacing w:after="0" w:line="420" w:lineRule="atLeast"/>
-        <w:rPr>
-          <w:rFonts w:ascii="Arial" w:eastAsia="Times New Roman" w:hAnsi="Arial" w:cs="Arial"/>
-          <w:color w:val="1F1F1F"/>
-          <w:kern w:val="0"/>
-          <w:sz w:val="24"/>
-          <w:szCs w:val="24"/>
-          <w:lang w:eastAsia="pt-BR"/>
-          <w14:ligatures w14:val="none"/>
-        </w:rPr>
-      </w:pPr>
-    </w:p>
-    <w:p>
-      <w:pPr>
-        <w:spacing w:after="0" w:line="420" w:lineRule="atLeast"/>
-        <w:rPr>
-          <w:rFonts w:ascii="Arial" w:eastAsia="Times New Roman" w:hAnsi="Arial" w:cs="Arial"/>
-          <w:color w:val="1F1F1F"/>
-          <w:kern w:val="0"/>
-          <w:sz w:val="24"/>
-          <w:szCs w:val="24"/>
-          <w:lang w:eastAsia="pt-BR"/>
-          <w14:ligatures w14:val="none"/>
-        </w:rPr>
-      </w:pPr>
-    </w:p>
-    <w:p>
-      <w:pPr>
-        <w:spacing w:after="0" w:line="420" w:lineRule="atLeast"/>
-        <w:rPr>
-          <w:rFonts w:ascii="Arial" w:eastAsia="Times New Roman" w:hAnsi="Arial" w:cs="Arial"/>
-          <w:color w:val="1F1F1F"/>
-          <w:kern w:val="0"/>
-          <w:sz w:val="24"/>
-          <w:szCs w:val="24"/>
-          <w:lang w:eastAsia="pt-BR"/>
-          <w14:ligatures w14:val="none"/>
-        </w:rPr>
-      </w:pPr>
-    </w:p>
-    <w:p>
-      <w:pPr>
-        <w:spacing w:after="0" w:line="420" w:lineRule="atLeast"/>
-        <w:rPr>
-          <w:rFonts w:ascii="Arial" w:eastAsia="Times New Roman" w:hAnsi="Arial" w:cs="Arial"/>
-          <w:color w:val="1F1F1F"/>
-          <w:kern w:val="0"/>
-          <w:sz w:val="24"/>
-          <w:szCs w:val="24"/>
-          <w:lang w:eastAsia="pt-BR"/>
-          <w14:ligatures w14:val="none"/>
-        </w:rPr>
-      </w:pPr>
-      <w:r>
-        <w:rPr>
-          <w:rFonts w:ascii="Arial" w:eastAsia="Times New Roman" w:hAnsi="Arial" w:cs="Arial"/>
-          <w:b/>
-          <w:bCs/>
-          <w:color w:val="1F1F1F"/>
-          <w:kern w:val="0"/>
-          <w:sz w:val="24"/>
-          <w:szCs w:val="24"/>
-          <w:bdr w:val="none" w:sz="0" w:space="0" w:color="auto" w:frame="1"/>
-          <w:lang w:eastAsia="pt-BR"/>
-          <w14:ligatures w14:val="none"/>
-        </w:rPr>
+        <w:lastRenderedPageBreak/>
         <w:t>Dicas:</w:t>
       </w:r>
     </w:p>
@@ -983,7 +3891,7 @@
 </file>
 
 <file path=word/numbering.xml><?xml version="1.0" encoding="utf-8"?>
-<w:numbering xmlns:wpc="http://schemas.microsoft.com/office/word/2010/wordprocessingCanvas" xmlns:cx="http://schemas.microsoft.com/office/drawing/2014/chartex" xmlns:cx1="http://schemas.microsoft.com/office/drawing/2015/9/8/chartex" xmlns:cx2="http://schemas.microsoft.com/office/drawing/2015/10/21/chartex" xmlns:cx3="http://schemas.microsoft.com/office/drawing/2016/5/9/chartex" xmlns:cx4="http://schemas.microsoft.com/office/drawing/2016/5/10/chartex" xmlns:cx5="http://schemas.microsoft.com/office/drawing/2016/5/11/chartex" xmlns:cx6="http://schemas.microsoft.com/office/drawing/2016/5/12/chartex" xmlns:cx7="http://schemas.microsoft.com/office/drawing/2016/5/13/chartex" xmlns:cx8="http://schemas.microsoft.com/office/drawing/2016/5/14/chartex" xmlns:mc="http://schemas.openxmlformats.org/markup-compatibility/2006" xmlns:aink="http://schemas.microsoft.com/office/drawing/2016/ink" xmlns:am3d="http://schemas.microsoft.com/office/drawing/2017/model3d" xmlns:o="urn:schemas-microsoft-com:office:office" xmlns:oel="http://schemas.microsoft.com/office/2019/extlst" xmlns:r="http://schemas.openxmlformats.org/officeDocument/2006/relationships" xmlns:m="http://schemas.openxmlformats.org/officeDocument/2006/math" xmlns:v="urn:schemas-microsoft-com:vml" xmlns:wp14="http://schemas.microsoft.com/office/word/2010/wordprocessingDrawing" xmlns:wp="http://schemas.openxmlformats.org/drawingml/2006/wordprocessingDrawing" xmlns:w10="urn:schemas-microsoft-com:office:word" xmlns:w="http://schemas.openxmlformats.org/wordprocessingml/2006/main" xmlns:w14="http://schemas.microsoft.com/office/word/2010/wordml" xmlns:w15="http://schemas.microsoft.com/office/word/2012/wordml" xmlns:w16cex="http://schemas.microsoft.com/office/word/2018/wordml/cex" xmlns:w16cid="http://schemas.microsoft.com/office/word/2016/wordml/cid" xmlns:w16="http://schemas.microsoft.com/office/word/2018/wordml" xmlns:w16sdtdh="http://schemas.microsoft.com/office/word/2020/wordml/sdtdatahash" xmlns:w16se="http://schemas.microsoft.com/office/word/2015/wordml/symex" xmlns:wpg="http://schemas.microsoft.com/office/word/2010/wordprocessingGroup" xmlns:wpi="http://schemas.microsoft.com/office/word/2010/wordprocessingInk" xmlns:wne="http://schemas.microsoft.com/office/word/2006/wordml" xmlns:wps="http://schemas.microsoft.com/office/word/2010/wordprocessingShape" mc:Ignorable="w14 w15 w16se w16cid w16 w16cex w16sdtdh wp14">
+<w:numbering xmlns:wpc="http://schemas.microsoft.com/office/word/2010/wordprocessingCanvas" xmlns:cx="http://schemas.microsoft.com/office/drawing/2014/chartex" xmlns:cx1="http://schemas.microsoft.com/office/drawing/2015/9/8/chartex" xmlns:cx2="http://schemas.microsoft.com/office/drawing/2015/10/21/chartex" xmlns:cx3="http://schemas.microsoft.com/office/drawing/2016/5/9/chartex" xmlns:cx4="http://schemas.microsoft.com/office/drawing/2016/5/10/chartex" xmlns:cx5="http://schemas.microsoft.com/office/drawing/2016/5/11/chartex" xmlns:cx6="http://schemas.microsoft.com/office/drawing/2016/5/12/chartex" xmlns:cx7="http://schemas.microsoft.com/office/drawing/2016/5/13/chartex" xmlns:cx8="http://schemas.microsoft.com/office/drawing/2016/5/14/chartex" xmlns:mc="http://schemas.openxmlformats.org/markup-compatibility/2006" xmlns:aink="http://schemas.microsoft.com/office/drawing/2016/ink" xmlns:am3d="http://schemas.microsoft.com/office/drawing/2017/model3d" xmlns:o="urn:schemas-microsoft-com:office:office" xmlns:r="http://schemas.openxmlformats.org/officeDocument/2006/relationships" xmlns:m="http://schemas.openxmlformats.org/officeDocument/2006/math" xmlns:v="urn:schemas-microsoft-com:vml" xmlns:wp14="http://schemas.microsoft.com/office/word/2010/wordprocessingDrawing" xmlns:wp="http://schemas.openxmlformats.org/drawingml/2006/wordprocessingDrawing" xmlns:w10="urn:schemas-microsoft-com:office:word" xmlns:w="http://schemas.openxmlformats.org/wordprocessingml/2006/main" xmlns:w14="http://schemas.microsoft.com/office/word/2010/wordml" xmlns:w15="http://schemas.microsoft.com/office/word/2012/wordml" xmlns:w16cex="http://schemas.microsoft.com/office/word/2018/wordml/cex" xmlns:w16cid="http://schemas.microsoft.com/office/word/2016/wordml/cid" xmlns:w16="http://schemas.microsoft.com/office/word/2018/wordml" xmlns:w16sdtdh="http://schemas.microsoft.com/office/word/2020/wordml/sdtdatahash" xmlns:w16se="http://schemas.microsoft.com/office/word/2015/wordml/symex" xmlns:wpg="http://schemas.microsoft.com/office/word/2010/wordprocessingGroup" xmlns:wpi="http://schemas.microsoft.com/office/word/2010/wordprocessingInk" xmlns:wne="http://schemas.microsoft.com/office/word/2006/wordml" xmlns:wps="http://schemas.microsoft.com/office/word/2010/wordprocessingShape" mc:Ignorable="w14 w15 w16se w16cid w16 w16cex w16sdtdh wp14">
   <w:abstractNum w:abstractNumId="0" w15:restartNumberingAfterBreak="0">
     <w:nsid w:val="20260822"/>
     <w:multiLevelType w:val="multilevel"/>
@@ -1134,6 +4042,96 @@
     </w:lvl>
   </w:abstractNum>
   <w:abstractNum w:abstractNumId="1" w15:restartNumberingAfterBreak="0">
+    <w:nsid w:val="3113615D"/>
+    <w:multiLevelType w:val="hybridMultilevel"/>
+    <w:tmpl w:val="4CDCEA32"/>
+    <w:lvl w:ilvl="0" w:tplc="8FCAD606">
+      <w:start w:val="1"/>
+      <w:numFmt w:val="decimal"/>
+      <w:lvlText w:val="%1."/>
+      <w:lvlJc w:val="left"/>
+      <w:pPr>
+        <w:ind w:left="720" w:hanging="360"/>
+      </w:pPr>
+      <w:rPr>
+        <w:rFonts w:hint="default"/>
+        <w:b/>
+      </w:rPr>
+    </w:lvl>
+    <w:lvl w:ilvl="1" w:tplc="04160019" w:tentative="1">
+      <w:start w:val="1"/>
+      <w:numFmt w:val="lowerLetter"/>
+      <w:lvlText w:val="%2."/>
+      <w:lvlJc w:val="left"/>
+      <w:pPr>
+        <w:ind w:left="1440" w:hanging="360"/>
+      </w:pPr>
+    </w:lvl>
+    <w:lvl w:ilvl="2" w:tplc="0416001B" w:tentative="1">
+      <w:start w:val="1"/>
+      <w:numFmt w:val="lowerRoman"/>
+      <w:lvlText w:val="%3."/>
+      <w:lvlJc w:val="right"/>
+      <w:pPr>
+        <w:ind w:left="2160" w:hanging="180"/>
+      </w:pPr>
+    </w:lvl>
+    <w:lvl w:ilvl="3" w:tplc="0416000F" w:tentative="1">
+      <w:start w:val="1"/>
+      <w:numFmt w:val="decimal"/>
+      <w:lvlText w:val="%4."/>
+      <w:lvlJc w:val="left"/>
+      <w:pPr>
+        <w:ind w:left="2880" w:hanging="360"/>
+      </w:pPr>
+    </w:lvl>
+    <w:lvl w:ilvl="4" w:tplc="04160019" w:tentative="1">
+      <w:start w:val="1"/>
+      <w:numFmt w:val="lowerLetter"/>
+      <w:lvlText w:val="%5."/>
+      <w:lvlJc w:val="left"/>
+      <w:pPr>
+        <w:ind w:left="3600" w:hanging="360"/>
+      </w:pPr>
+    </w:lvl>
+    <w:lvl w:ilvl="5" w:tplc="0416001B" w:tentative="1">
+      <w:start w:val="1"/>
+      <w:numFmt w:val="lowerRoman"/>
+      <w:lvlText w:val="%6."/>
+      <w:lvlJc w:val="right"/>
+      <w:pPr>
+        <w:ind w:left="4320" w:hanging="180"/>
+      </w:pPr>
+    </w:lvl>
+    <w:lvl w:ilvl="6" w:tplc="0416000F" w:tentative="1">
+      <w:start w:val="1"/>
+      <w:numFmt w:val="decimal"/>
+      <w:lvlText w:val="%7."/>
+      <w:lvlJc w:val="left"/>
+      <w:pPr>
+        <w:ind w:left="5040" w:hanging="360"/>
+      </w:pPr>
+    </w:lvl>
+    <w:lvl w:ilvl="7" w:tplc="04160019" w:tentative="1">
+      <w:start w:val="1"/>
+      <w:numFmt w:val="lowerLetter"/>
+      <w:lvlText w:val="%8."/>
+      <w:lvlJc w:val="left"/>
+      <w:pPr>
+        <w:ind w:left="5760" w:hanging="360"/>
+      </w:pPr>
+    </w:lvl>
+    <w:lvl w:ilvl="8" w:tplc="0416001B" w:tentative="1">
+      <w:start w:val="1"/>
+      <w:numFmt w:val="lowerRoman"/>
+      <w:lvlText w:val="%9."/>
+      <w:lvlJc w:val="right"/>
+      <w:pPr>
+        <w:ind w:left="6480" w:hanging="180"/>
+      </w:pPr>
+    </w:lvl>
+  </w:abstractNum>
+  <w:abstractNum w:abstractNumId="2" w15:restartNumberingAfterBreak="0">
     <w:nsid w:val="5019097F"/>
     <w:multiLevelType w:val="multilevel"/>
     <w:tmpl w:val="099AB9EE"/>
@@ -1282,11 +4280,14 @@
       </w:rPr>
     </w:lvl>
   </w:abstractNum>
-  <w:num w:numId="1" w16cid:durableId="1215310941">
+  <w:num w:numId="1">
+    <w:abstractNumId w:val="2"/>
+  </w:num>
+  <w:num w:numId="2">
+    <w:abstractNumId w:val="0"/>
+  </w:num>
+  <w:num w:numId="3">
     <w:abstractNumId w:val="1"/>
-  </w:num>
-  <w:num w:numId="2" w16cid:durableId="911499241">
-    <w:abstractNumId w:val="0"/>
   </w:num>
 </w:numbering>
 </file>
@@ -2547,6 +5548,23 @@
 </file>
 
 <file path=customXml/item1.xml><?xml version="1.0" encoding="utf-8"?>
+<p:properties xmlns:p="http://schemas.microsoft.com/office/2006/metadata/properties" xmlns:xsi="http://www.w3.org/2001/XMLSchema-instance" xmlns:pc="http://schemas.microsoft.com/office/infopath/2007/PartnerControls">
+  <documentManagement>
+    <_activity xmlns="3c1dc2a5-f87b-4340-a568-c485be23fc77" xsi:nil="true"/>
+  </documentManagement>
+</p:properties>
+</file>
+
+<file path=customXml/item2.xml><?xml version="1.0" encoding="utf-8"?>
+<?mso-contentType ?>
+<FormTemplates xmlns="http://schemas.microsoft.com/sharepoint/v3/contenttype/forms">
+  <Display>DocumentLibraryForm</Display>
+  <Edit>DocumentLibraryForm</Edit>
+  <New>DocumentLibraryForm</New>
+</FormTemplates>
+</file>
+
+<file path=customXml/item3.xml><?xml version="1.0" encoding="utf-8"?>
 <ct:contentTypeSchema xmlns:ct="http://schemas.microsoft.com/office/2006/metadata/contentType" xmlns:ma="http://schemas.microsoft.com/office/2006/metadata/properties/metaAttributes" ct:_="" ma:_="" ma:contentTypeName="Documento" ma:contentTypeID="0x01010025E8FFB4BADE9C4AA27420827F0B6B02" ma:contentTypeVersion="12" ma:contentTypeDescription="Crie um novo documento." ma:contentTypeScope="" ma:versionID="8eda228dbfb4ebf69b34bd2605e74849">
   <xsd:schema xmlns:xsd="http://www.w3.org/2001/XMLSchema" xmlns:xs="http://www.w3.org/2001/XMLSchema" xmlns:p="http://schemas.microsoft.com/office/2006/metadata/properties" xmlns:ns3="3c1dc2a5-f87b-4340-a568-c485be23fc77" xmlns:ns4="2252625f-9dae-43d1-b737-452d42f6f3f1" targetNamespace="http://schemas.microsoft.com/office/2006/metadata/properties" ma:root="true" ma:fieldsID="56d0fa646dc12c2cd39f9dcc7254de8d" ns3:_="" ns4:_="">
     <xsd:import namespace="3c1dc2a5-f87b-4340-a568-c485be23fc77"/>
@@ -2761,24 +5779,25 @@
 </ct:contentTypeSchema>
 </file>
 
-<file path=customXml/item2.xml><?xml version="1.0" encoding="utf-8"?>
-<?mso-contentType ?>
-<FormTemplates xmlns="http://schemas.microsoft.com/sharepoint/v3/contenttype/forms">
-  <Display>DocumentLibraryForm</Display>
-  <Edit>DocumentLibraryForm</Edit>
-  <New>DocumentLibraryForm</New>
-</FormTemplates>
+<file path=customXml/itemProps1.xml><?xml version="1.0" encoding="utf-8"?>
+<ds:datastoreItem xmlns:ds="http://schemas.openxmlformats.org/officeDocument/2006/customXml" ds:itemID="{BDBF7CE4-D638-4447-A31D-497790B080AC}">
+  <ds:schemaRefs>
+    <ds:schemaRef ds:uri="http://schemas.microsoft.com/office/2006/metadata/properties"/>
+    <ds:schemaRef ds:uri="http://schemas.microsoft.com/office/infopath/2007/PartnerControls"/>
+    <ds:schemaRef ds:uri="3c1dc2a5-f87b-4340-a568-c485be23fc77"/>
+  </ds:schemaRefs>
+</ds:datastoreItem>
 </file>
 
-<file path=customXml/item3.xml><?xml version="1.0" encoding="utf-8"?>
-<p:properties xmlns:p="http://schemas.microsoft.com/office/2006/metadata/properties" xmlns:xsi="http://www.w3.org/2001/XMLSchema-instance" xmlns:pc="http://schemas.microsoft.com/office/infopath/2007/PartnerControls">
-  <documentManagement>
-    <_activity xmlns="3c1dc2a5-f87b-4340-a568-c485be23fc77" xsi:nil="true"/>
-  </documentManagement>
-</p:properties>
+<file path=customXml/itemProps2.xml><?xml version="1.0" encoding="utf-8"?>
+<ds:datastoreItem xmlns:ds="http://schemas.openxmlformats.org/officeDocument/2006/customXml" ds:itemID="{F6813F46-90DA-4995-8317-C4AC2B3C4E44}">
+  <ds:schemaRefs>
+    <ds:schemaRef ds:uri="http://schemas.microsoft.com/sharepoint/v3/contenttype/forms"/>
+  </ds:schemaRefs>
+</ds:datastoreItem>
 </file>
 
-<file path=customXml/itemProps1.xml><?xml version="1.0" encoding="utf-8"?>
+<file path=customXml/itemProps3.xml><?xml version="1.0" encoding="utf-8"?>
 <ds:datastoreItem xmlns:ds="http://schemas.openxmlformats.org/officeDocument/2006/customXml" ds:itemID="{A1CD147A-8F09-40E8-991D-BF3F796CB237}">
   <ds:schemaRefs>
     <ds:schemaRef ds:uri="http://schemas.microsoft.com/office/2006/metadata/contentType"/>
@@ -2795,29 +5814,4 @@
     <ds:schemaRef ds:uri="http://schemas.microsoft.com/internal/obd"/>
   </ds:schemaRefs>
 </ds:datastoreItem>
-</file>
-
-<file path=customXml/itemProps2.xml><?xml version="1.0" encoding="utf-8"?>
-<ds:datastoreItem xmlns:ds="http://schemas.openxmlformats.org/officeDocument/2006/customXml" ds:itemID="{F6813F46-90DA-4995-8317-C4AC2B3C4E44}">
-  <ds:schemaRefs>
-    <ds:schemaRef ds:uri="http://schemas.microsoft.com/sharepoint/v3/contenttype/forms"/>
-  </ds:schemaRefs>
-</ds:datastoreItem>
-</file>
-
-<file path=customXml/itemProps3.xml><?xml version="1.0" encoding="utf-8"?>
-<ds:datastoreItem xmlns:ds="http://schemas.openxmlformats.org/officeDocument/2006/customXml" ds:itemID="{BDBF7CE4-D638-4447-A31D-497790B080AC}">
-  <ds:schemaRefs>
-    <ds:schemaRef ds:uri="3c1dc2a5-f87b-4340-a568-c485be23fc77"/>
-    <ds:schemaRef ds:uri="http://purl.org/dc/elements/1.1/"/>
-    <ds:schemaRef ds:uri="http://schemas.microsoft.com/office/2006/documentManagement/types"/>
-    <ds:schemaRef ds:uri="http://purl.org/dc/terms/"/>
-    <ds:schemaRef ds:uri="http://schemas.microsoft.com/office/infopath/2007/PartnerControls"/>
-    <ds:schemaRef ds:uri="http://schemas.openxmlformats.org/package/2006/metadata/core-properties"/>
-    <ds:schemaRef ds:uri="http://schemas.microsoft.com/office/2006/metadata/properties"/>
-    <ds:schemaRef ds:uri="2252625f-9dae-43d1-b737-452d42f6f3f1"/>
-    <ds:schemaRef ds:uri="http://www.w3.org/XML/1998/namespace"/>
-    <ds:schemaRef ds:uri="http://purl.org/dc/dcmitype/"/>
-  </ds:schemaRefs>
-</ds:datastoreItem>
 </file>
</xml_diff>